<commit_message>
feat(spec): release v3.2.0 baseline with Lemon Squeezy MoR, guest intake, offline recovery key, and 424h WBS
</commit_message>
<xml_diff>
--- a/Resources/BRD.docx
+++ b/Resources/BRD.docx
@@ -52,7 +52,7 @@
           <w:color w:val="78827D"/>
           <w:sz w:val="19"/>
         </w:rPr>
-        <w:t xml:space="preserve">: Commercial Baseline &amp; Academic Evaluation Specification (Version 3.0.0)</w:t>
+        <w:t xml:space="preserve">: Commercial Baseline &amp; Academic Evaluation Specification (Version 3.2.0)</w:t>
       </w:r>
     </w:p>
     <w:p xmlns:w="http://schemas.openxmlformats.org/wordprocessingml/2006/main">
@@ -722,7 +722,7 @@
                 <w:color w:val="222222"/>
                 <w:sz w:val="18"/>
               </w:rPr>
-              <w:t xml:space="preserve">Decoupled 3-Tier Web Application (Next.js 14+ App Router, Node.js 22 LTS, PostgreSQL 16 on Neon, OpenPGP.js Client Crypto, Tailwind CSS)</w:t>
+              <w:t xml:space="preserve">Decoupled 3-Tier Web Application (Next.js 14+ App Router, Node.js 22 LTS, PostgreSQL 16 on Neon, OpenPGP.js Client Crypto, Cloudflare R2, Tailwind CSS)</w:t>
             </w:r>
           </w:p>
         </w:tc>
@@ -830,7 +830,7 @@
                 <w:color w:val="222222"/>
                 <w:sz w:val="18"/>
               </w:rPr>
-              <w:t xml:space="preserve">16 Calendar Weeks (Milestone 1: Weeks 1–8 Core; Milestone 2: Weeks 9–12 Pilot &amp; Defense; Milestone 3: Weeks 13–16 Commercial Launch)</w:t>
+              <w:t xml:space="preserve">18 Calendar Weeks (Part A: Weeks 1–12 Academic Prototype Baseline; Part B: Weeks 13–18 Commercial Launch &amp; Pilot)</w:t>
             </w:r>
           </w:p>
         </w:tc>
@@ -1186,7 +1186,23 @@
           <w:color w:val="222222"/>
           <w:sz w:val="20"/>
         </w:rPr>
-        <w:t xml:space="preserve">: Sensitive exploit descriptions, reproduction steps, and proof-of-concept (PoC) attachments are encrypted directly in the researcher's browser using OpenPGP before transmission. Backend databases and application APIs persist and route ciphertext only. To prevent sensitive title leakage in URLs, notification logs, and dashboards, titles are encrypted client-side while exposing a neutral, server-readable operational category label (</w:t>
+        <w:t xml:space="preserve">: Sensitive exploit descriptions, reproduction steps, and proof-of-concept (PoC) attachments are encrypted directly in the browser using OpenPGP before transmission. To maximize researcher adoption and eliminate friction, researchers can submit findings without account registration using ephemeral Curve25519 keys and secret tracking URLs. To prevent sensitive title leakage in URLs, notification logs, and dashboards, titles are encrypted client-side (</w:t>
+      </w:r>
+      <w:r>
+        <w:rPr>
+          <w:rFonts w:ascii="Consolas" w:hAnsi="Consolas"/>
+          <w:color w:val="9C4146"/>
+          <w:sz w:val="20"/>
+        </w:rPr>
+        <w:t xml:space="preserve">title_ciphertext</w:t>
+      </w:r>
+      <w:r>
+        <w:rPr>
+          <w:rFonts w:ascii="Lexend" w:hAnsi="Lexend"/>
+          <w:color w:val="222222"/>
+          <w:sz w:val="20"/>
+        </w:rPr>
+        <w:t xml:space="preserve">) while exposing a neutral, server-readable operational category label (</w:t>
       </w:r>
       <w:r>
         <w:rPr>
@@ -1233,7 +1249,103 @@
           <w:color w:val="222222"/>
           <w:sz w:val="20"/>
         </w:rPr>
-        <w:t xml:space="preserve">: Decoupling the declaration of a fix from its verification, verifying commit existence and branch presence via the GitHub REST API v3, and enforcing an audited retest state machine with distinct, mutually exclusive terminal closure states.</w:t>
+        <w:t xml:space="preserve">: Decoupling the declaration of a fix from its verification, verifying commit existence and branch presence via the GitHub REST API v3, and enforcing an audited retest state machine with distinct, mutually exclusive terminal closure states (</w:t>
+      </w:r>
+      <w:r>
+        <w:rPr>
+          <w:rFonts w:ascii="Consolas" w:hAnsi="Consolas"/>
+          <w:color w:val="9C4146"/>
+          <w:sz w:val="20"/>
+        </w:rPr>
+        <w:t xml:space="preserve">VERIFIED_RESEARCHER</w:t>
+      </w:r>
+      <w:r>
+        <w:rPr>
+          <w:rFonts w:ascii="Lexend" w:hAnsi="Lexend"/>
+          <w:color w:val="222222"/>
+          <w:sz w:val="20"/>
+        </w:rPr>
+        <w:t xml:space="preserve">, </w:t>
+      </w:r>
+      <w:r>
+        <w:rPr>
+          <w:rFonts w:ascii="Consolas" w:hAnsi="Consolas"/>
+          <w:color w:val="9C4146"/>
+          <w:sz w:val="20"/>
+        </w:rPr>
+        <w:t xml:space="preserve">VERIFIED_INTERNAL</w:t>
+      </w:r>
+      <w:r>
+        <w:rPr>
+          <w:rFonts w:ascii="Lexend" w:hAnsi="Lexend"/>
+          <w:color w:val="222222"/>
+          <w:sz w:val="20"/>
+        </w:rPr>
+        <w:t xml:space="preserve">, </w:t>
+      </w:r>
+      <w:r>
+        <w:rPr>
+          <w:rFonts w:ascii="Consolas" w:hAnsi="Consolas"/>
+          <w:color w:val="9C4146"/>
+          <w:sz w:val="20"/>
+        </w:rPr>
+        <w:t xml:space="preserve">CLOSED_UNVERIFIED_TIMEOUT</w:t>
+      </w:r>
+      <w:r>
+        <w:rPr>
+          <w:rFonts w:ascii="Lexend" w:hAnsi="Lexend"/>
+          <w:color w:val="222222"/>
+          <w:sz w:val="20"/>
+        </w:rPr>
+        <w:t xml:space="preserve">, </w:t>
+      </w:r>
+      <w:r>
+        <w:rPr>
+          <w:rFonts w:ascii="Consolas" w:hAnsi="Consolas"/>
+          <w:color w:val="9C4146"/>
+          <w:sz w:val="20"/>
+        </w:rPr>
+        <w:t xml:space="preserve">RISK_ACCEPTED</w:t>
+      </w:r>
+      <w:r>
+        <w:rPr>
+          <w:rFonts w:ascii="Lexend" w:hAnsi="Lexend"/>
+          <w:color w:val="222222"/>
+          <w:sz w:val="20"/>
+        </w:rPr>
+        <w:t xml:space="preserve">, </w:t>
+      </w:r>
+      <w:r>
+        <w:rPr>
+          <w:rFonts w:ascii="Consolas" w:hAnsi="Consolas"/>
+          <w:color w:val="9C4146"/>
+          <w:sz w:val="20"/>
+        </w:rPr>
+        <w:t xml:space="preserve">REJECTED_SPAM</w:t>
+      </w:r>
+      <w:r>
+        <w:rPr>
+          <w:rFonts w:ascii="Lexend" w:hAnsi="Lexend"/>
+          <w:color w:val="222222"/>
+          <w:sz w:val="20"/>
+        </w:rPr>
+        <w:t xml:space="preserve">, </w:t>
+      </w:r>
+      <w:r>
+        <w:rPr>
+          <w:rFonts w:ascii="Consolas" w:hAnsi="Consolas"/>
+          <w:color w:val="9C4146"/>
+          <w:sz w:val="20"/>
+        </w:rPr>
+        <w:t xml:space="preserve">WITHDRAWN</w:t>
+      </w:r>
+      <w:r>
+        <w:rPr>
+          <w:rFonts w:ascii="Lexend" w:hAnsi="Lexend"/>
+          <w:color w:val="222222"/>
+          <w:sz w:val="20"/>
+        </w:rPr>
+        <w:t xml:space="preserve">).</w:t>
       </w:r>
     </w:p>
     <w:p xmlns:w="http://schemas.openxmlformats.org/wordprocessingml/2006/main">
@@ -1264,7 +1376,7 @@
           <w:color w:val="222222"/>
           <w:sz w:val="20"/>
         </w:rPr>
-        <w:t xml:space="preserve">: Enabling engineering leads to generate customer-controlled, sanitized PDF/HTML closure evidence summaries that document the vulnerability's timeline, verified commit hash, deployment environment, and retest attestation without exposing raw exploit code.</w:t>
+        <w:t xml:space="preserve">: Enabling engineering leads to generate customer-controlled, sanitized PDF/JSON closure evidence summaries that document the vulnerability's timeline, verified commit hash, deployment environment, and retest attestation without exposing raw exploit code. Included natively in the commercial Team plan ($49/mo).</w:t>
       </w:r>
     </w:p>
     <w:p xmlns:w="http://schemas.openxmlformats.org/wordprocessingml/2006/main">
@@ -1287,7 +1399,7 @@
           <w:color w:val="222222"/>
           <w:sz w:val="20"/>
         </w:rPr>
-        <w:t xml:space="preserve">Streamlined Onboarding &amp; Guided Program Setup</w:t>
+        <w:t xml:space="preserve">Streamlined Onboarding &amp; Disaster-Resilient Key Management</w:t>
       </w:r>
       <w:r>
         <w:rPr>
@@ -1311,7 +1423,7 @@
           <w:color w:val="222222"/>
           <w:sz w:val="20"/>
         </w:rPr>
-        <w:t xml:space="preserve"> generation, and Disclose.io-aligned safe harbor configuration in under 15 minutes.</w:t>
+        <w:t xml:space="preserve"> generation, Disclose.io safe harbor configuration, and mandatory offline Organization Master Recovery Key export with test decryption verification in under 15 minutes.</w:t>
       </w:r>
     </w:p>
     <w:p xmlns:w="http://schemas.openxmlformats.org/wordprocessingml/2006/main">
@@ -1511,7 +1623,7 @@
                 <w:color w:val="222222"/>
                 <w:sz w:val="18"/>
               </w:rPr>
-              <w:t xml:space="preserve">Client-Side Payload Confidentiality &amp; Neutral Labeling</w:t>
+              <w:t xml:space="preserve">Client-Side Payload Confidentiality &amp; Curve25519 Pinning</w:t>
             </w:r>
           </w:p>
         </w:tc>
@@ -1536,39 +1648,7 @@
                 <w:color w:val="222222"/>
                 <w:sz w:val="18"/>
               </w:rPr>
-              <w:t xml:space="preserve">Protect sensitive exploit data from server-side database exposure by performing asymmetric OpenPGP encryption in the client browser, combining encrypted titles (</w:t>
-            </w:r>
-            <w:r>
-              <w:rPr>
-                <w:rFonts w:ascii="Consolas" w:hAnsi="Consolas"/>
-                <w:color w:val="9C4146"/>
-                <w:sz w:val="18"/>
-              </w:rPr>
-              <w:t xml:space="preserve">title_ciphertext</w:t>
-            </w:r>
-            <w:r>
-              <w:rPr>
-                <w:rFonts w:ascii="Lexend" w:hAnsi="Lexend"/>
-                <w:color w:val="222222"/>
-                <w:sz w:val="18"/>
-              </w:rPr>
-              <w:t xml:space="preserve">) with neutral operational labels (</w:t>
-            </w:r>
-            <w:r>
-              <w:rPr>
-                <w:rFonts w:ascii="Consolas" w:hAnsi="Consolas"/>
-                <w:color w:val="9C4146"/>
-                <w:sz w:val="18"/>
-              </w:rPr>
-              <w:t xml:space="preserve">operational_label</w:t>
-            </w:r>
-            <w:r>
-              <w:rPr>
-                <w:rFonts w:ascii="Lexend" w:hAnsi="Lexend"/>
-                <w:color w:val="222222"/>
-                <w:sz w:val="18"/>
-              </w:rPr>
-              <w:t xml:space="preserve">).</w:t>
+              <w:t xml:space="preserve">Protect sensitive exploit data from server-side database exposure by performing asymmetric OpenPGP encryption in the browser, pinning strictly to v4 Ed25519/X25519 keys (&lt;50ms keygen) and Argon2 S2K key protection.</w:t>
             </w:r>
           </w:p>
         </w:tc>
@@ -1593,7 +1673,7 @@
                 <w:color w:val="222222"/>
                 <w:sz w:val="18"/>
               </w:rPr>
-              <w:t xml:space="preserve">100% of vulnerability descriptions, steps, attachments, and specific titles stored exclusively as ciphertext. 0 plaintext exploit bytes in database dumps.</w:t>
+              <w:t xml:space="preserve">100% of vulnerability descriptions, steps, attachments, and specific titles stored exclusively as ciphertext. 0 plaintext exploit bytes in database dumps. Keygen &lt; 1.5s (NFR-02).</w:t>
             </w:r>
           </w:p>
         </w:tc>
@@ -1853,7 +1933,39 @@
                 <w:color w:val="222222"/>
                 <w:sz w:val="18"/>
               </w:rPr>
-              <w:t xml:space="preserve">100% calculation accuracy across 52 canonical test vectors derived from FIRST.org Appendix A and NIST NVD benchmarks; mandatory recording of CVSS vector, score, assessor identity, and justification.</w:t>
+              <w:t xml:space="preserve">100% calculation accuracy across 45 canonical unique test vectors documented in </w:t>
+            </w:r>
+            <w:r>
+              <w:rPr>
+                <w:rFonts w:ascii="Consolas" w:hAnsi="Consolas"/>
+                <w:color w:val="9C4146"/>
+                <w:sz w:val="18"/>
+              </w:rPr>
+              <w:t xml:space="preserve">CVSS_TEST_FIXTURES.md</w:t>
+            </w:r>
+            <w:r>
+              <w:rPr>
+                <w:rFonts w:ascii="Lexend" w:hAnsi="Lexend"/>
+                <w:color w:val="222222"/>
+                <w:sz w:val="18"/>
+              </w:rPr>
+              <w:t xml:space="preserve"> verified via </w:t>
+            </w:r>
+            <w:r>
+              <w:rPr>
+                <w:rFonts w:ascii="Consolas" w:hAnsi="Consolas"/>
+                <w:color w:val="9C4146"/>
+                <w:sz w:val="18"/>
+              </w:rPr>
+              <w:t xml:space="preserve">verify_cvss_engine.py</w:t>
+            </w:r>
+            <w:r>
+              <w:rPr>
+                <w:rFonts w:ascii="Lexend" w:hAnsi="Lexend"/>
+                <w:color w:val="222222"/>
+                <w:sz w:val="18"/>
+              </w:rPr>
+              <w:t xml:space="preserve">; mandatory recording of CVSS vector, score, assessor identity, and justification.</w:t>
             </w:r>
           </w:p>
         </w:tc>
@@ -1909,7 +2021,7 @@
                 <w:color w:val="222222"/>
                 <w:sz w:val="18"/>
               </w:rPr>
-              <w:t xml:space="preserve">Remediation Traceability</w:t>
+              <w:t xml:space="preserve">Remediation Traceability &amp; Branch Membership</w:t>
             </w:r>
           </w:p>
         </w:tc>
@@ -1935,7 +2047,7 @@
                 <w:color w:val="222222"/>
                 <w:sz w:val="18"/>
               </w:rPr>
-              <w:t xml:space="preserve">Decouple fix declaration from fix verification by linking remediation claims to verifiable GitHub commit SHAs (via GitHub REST API v3 for public and private repositories) or cryptographic configuration hashes.</w:t>
+              <w:t xml:space="preserve">Decouple fix declaration from fix verification by linking remediation claims to verifiable GitHub commit SHAs and verifying branch presence via GitHub compare API.</w:t>
             </w:r>
           </w:p>
         </w:tc>
@@ -2015,7 +2127,7 @@
                 <w:color w:val="222222"/>
                 <w:sz w:val="18"/>
               </w:rPr>
-              <w:t xml:space="preserve">Accountable Closure State Machine &amp; SLA Timers</w:t>
+              <w:t xml:space="preserve">Accountable Closure State Machine &amp; Tamper-Evident Ledger</w:t>
             </w:r>
           </w:p>
         </w:tc>
@@ -2040,7 +2152,23 @@
                 <w:color w:val="222222"/>
                 <w:sz w:val="18"/>
               </w:rPr>
-              <w:t xml:space="preserve">Prevent premature or unverified bug closure through distinct, mutually exclusive terminal states, mandatory retest attestation records, and configurable SLA countdown timers.</w:t>
+              <w:t xml:space="preserve">Prevent premature or unverified bug closure through distinct terminal states, mandatory retest attestation records, configurable SLA timers, and a SHA-256 hash-chained audit ledger (</w:t>
+            </w:r>
+            <w:r>
+              <w:rPr>
+                <w:rFonts w:ascii="Consolas" w:hAnsi="Consolas"/>
+                <w:color w:val="9C4146"/>
+                <w:sz w:val="18"/>
+              </w:rPr>
+              <w:t xml:space="preserve">prev_hash</w:t>
+            </w:r>
+            <w:r>
+              <w:rPr>
+                <w:rFonts w:ascii="Lexend" w:hAnsi="Lexend"/>
+                <w:color w:val="222222"/>
+                <w:sz w:val="18"/>
+              </w:rPr>
+              <w:t xml:space="preserve">).</w:t>
             </w:r>
           </w:p>
         </w:tc>
@@ -2065,7 +2193,7 @@
                 <w:color w:val="222222"/>
                 <w:sz w:val="18"/>
               </w:rPr>
-              <w:t xml:space="preserve">Every closed report shall have a recorded closure category and justification. Only successfully retested reports shall be labeled verified. Rejected, duplicate, and unverified-timeout outcomes shall be reported separately.</w:t>
+              <w:t xml:space="preserve">Every closed report shall have a recorded closure category and justification. Only successfully retested reports shall be labeled verified. Rejected, duplicate, risk-accepted, and timeout outcomes shall be reported separately.</w:t>
             </w:r>
           </w:p>
         </w:tc>
@@ -2121,7 +2249,7 @@
                 <w:color w:val="222222"/>
                 <w:sz w:val="18"/>
               </w:rPr>
-              <w:t xml:space="preserve">Two-Tier Financial Viability &amp; Production Cloud Budget</w:t>
+              <w:t xml:space="preserve">Financial Viability &amp; Merchant of Record Compliance</w:t>
             </w:r>
           </w:p>
         </w:tc>
@@ -2147,7 +2275,7 @@
                 <w:color w:val="222222"/>
                 <w:sz w:val="18"/>
               </w:rPr>
-              <w:t xml:space="preserve">Demonstrate zero-cost academic prototype viability on free cloud tiers (0.00/mo) while defining a sustainable, commercially viable production cloud infrastructure budget (~60–$80/mo baseline) supported by paid SaaS subscription tiers.</w:t>
+              <w:t xml:space="preserve">Demonstrate zero-cost academic prototype viability on free cloud tiers (0.00/mo) while defining a commercially compliant SaaS model using Lemon Squeezy as Merchant of Record (handling global tax and direct Pakistan bank payouts) with a 49/mo Team plan and free Open-Source tier.</w:t>
             </w:r>
           </w:p>
         </w:tc>
@@ -2173,7 +2301,7 @@
                 <w:color w:val="222222"/>
                 <w:sz w:val="18"/>
               </w:rPr>
-              <w:t xml:space="preserve">Academic prototype operational cost bounded at 0.00/month; commercial production architecture validated within ~60–$80/month for up to 10 paying tenant organizations.</w:t>
+              <w:t xml:space="preserve">Academic prototype operational cost bounded at 0.00/month; commercial production architecture validated within ~61.00/month, fully covered with 2 paying customers ($98/mo gross).</w:t>
             </w:r>
           </w:p>
         </w:tc>
@@ -2383,6 +2511,22 @@
               </w:rPr>
               <w:t xml:space="preserve">Hunter</w:t>
             </w:r>
+            <w:r>
+              <w:rPr>
+                <w:rFonts w:ascii="Lexend" w:hAnsi="Lexend"/>
+                <w:color w:val="222222"/>
+                <w:sz w:val="18"/>
+              </w:rPr>
+              <w:t xml:space="preserve"> / </w:t>
+            </w:r>
+            <w:r>
+              <w:rPr>
+                <w:rFonts w:ascii="Consolas" w:hAnsi="Consolas"/>
+                <w:color w:val="9C4146"/>
+                <w:sz w:val="18"/>
+              </w:rPr>
+              <w:t xml:space="preserve">Guest Hunter</w:t>
+            </w:r>
           </w:p>
         </w:tc>
         <w:tc>
@@ -2406,7 +2550,7 @@
                 <w:color w:val="222222"/>
                 <w:sz w:val="18"/>
               </w:rPr>
-              <w:t xml:space="preserve">Discovers in-scope vulnerabilities; encrypts sensitive payloads client-side; submits reports; conducts empirical retests upon notification.</w:t>
+              <w:t xml:space="preserve">Discovers in-scope vulnerabilities; submits via guest intake or verified account; encrypts payloads client-side; conducts empirical retests upon notification.</w:t>
             </w:r>
           </w:p>
         </w:tc>
@@ -2431,7 +2575,7 @@
                 <w:color w:val="222222"/>
                 <w:sz w:val="18"/>
               </w:rPr>
-              <w:t xml:space="preserve">Full access to own submitted reports, encrypted communication lane with defender, public program policies, and personal reputation record.</w:t>
+              <w:t xml:space="preserve">Full access to own submitted reports (via session auth or secret tracking URL), encrypted communication lane with defender, public program policies.</w:t>
             </w:r>
           </w:p>
         </w:tc>
@@ -2512,7 +2656,7 @@
                 <w:color w:val="222222"/>
                 <w:sz w:val="18"/>
               </w:rPr>
-              <w:t xml:space="preserve">Reviews intake; designated active Decryption Custodian; decrypts payloads in-browser using local private key; assigns CVSS scores; coordinates remediation; requests retests.</w:t>
+              <w:t xml:space="preserve">Reviews intake; decrypts payloads in-browser using local private key; assigns CVSS scores; coordinates remediation; requests retests.</w:t>
             </w:r>
           </w:p>
         </w:tc>
@@ -2616,7 +2760,7 @@
                 <w:color w:val="222222"/>
                 <w:sz w:val="18"/>
               </w:rPr>
-              <w:t xml:space="preserve">Manages tenant workspace, invites members, signs RFC 9116 policies, manages key backups/succession, and executes authorized ticket reopening.</w:t>
+              <w:t xml:space="preserve">Manages tenant workspace, invites members, signs RFC 9116 policies, holds offline master recovery key, and manages subscription.</w:t>
             </w:r>
           </w:p>
         </w:tc>
@@ -2641,7 +2785,7 @@
                 <w:color w:val="222222"/>
                 <w:sz w:val="18"/>
               </w:rPr>
-              <w:t xml:space="preserve">Administrative control over organization profile, domain DNS verification, member roles, billing subscription, and program rules.</w:t>
+              <w:t xml:space="preserve">Administrative control over organization profile, domain DNS verification, member roles, billing subscription, and offline disaster recovery.</w:t>
             </w:r>
           </w:p>
         </w:tc>
@@ -2826,7 +2970,7 @@
                 <w:color w:val="222222"/>
                 <w:sz w:val="18"/>
               </w:rPr>
-              <w:t xml:space="preserve">Provisions tenant accounts, monitors platform uptime, inspects rate-limiting logs, and manages platform configuration.</w:t>
+              <w:t xml:space="preserve">Provisions tenant accounts, monitors platform uptime, inspects rate-limiting logs, and manages platform abuse.</w:t>
             </w:r>
           </w:p>
         </w:tc>
@@ -3061,7 +3205,7 @@
           <w:color w:val="222222"/>
           <w:sz w:val="20"/>
         </w:rPr>
-        <w:t xml:space="preserve">: Access permissions shall be strictly enforced on the server across four distinct roles: Tenant Owner (</w:t>
+        <w:t xml:space="preserve">: Access permissions shall be strictly enforced on the server across distinct roles: Tenant Owner (</w:t>
       </w:r>
       <w:r>
         <w:rPr>
@@ -3109,7 +3253,7 @@
           <w:color w:val="222222"/>
           <w:sz w:val="20"/>
         </w:rPr>
-        <w:t xml:space="preserve">), and External Researcher (</w:t>
+        <w:t xml:space="preserve">), and Researcher (</w:t>
       </w:r>
       <w:r>
         <w:rPr>
@@ -3156,24 +3300,7 @@
           <w:color w:val="222222"/>
           <w:sz w:val="20"/>
         </w:rPr>
-        <w:t xml:space="preserve">: Users shall authenticate against the server using email and bcrypt-hashed (rounds = 12) </w:t>
-      </w:r>
-      <w:r>
-        <w:rPr>
-          <w:rFonts w:ascii="Lexend" w:hAnsi="Lexend"/>
-          <w:b/>
-          <w:color w:val="222222"/>
-          <w:sz w:val="20"/>
-        </w:rPr>
-        <w:t xml:space="preserve">login passwords</w:t>
-      </w:r>
-      <w:r>
-        <w:rPr>
-          <w:rFonts w:ascii="Lexend" w:hAnsi="Lexend"/>
-          <w:color w:val="222222"/>
-          <w:sz w:val="20"/>
-        </w:rPr>
-        <w:t xml:space="preserve"> transmitted over TLS, receiving signed, HTTP-only JWT session cookies. Organization Owners and Defenders shall support Time-Based One-Time Password (TOTP) Multi-Factor Authentication. The login password is strictly separated from the local encryption passphrase.</w:t>
+        <w:t xml:space="preserve">: Users shall authenticate against the server using email and bcrypt/Argon2-hashed login passwords, backed by database-persisted session tokens stored in secure, HTTP-only cookies. Organization Owners and Defenders shall support Time-Based One-Time Password (TOTP) Multi-Factor Authentication. The login password is strictly separated from the local encryption passphrase.</w:t>
       </w:r>
     </w:p>
     <w:p xmlns:w="http://schemas.openxmlformats.org/wordprocessingml/2006/main">
@@ -3204,7 +3331,7 @@
           <w:color w:val="222222"/>
           <w:sz w:val="20"/>
         </w:rPr>
-        <w:t xml:space="preserve">: Organizations shall be guided through a streamlined Onboarding Wizard covering domain DNS verification, policy definition, browser-side keypair generation, and RFC 9116 </w:t>
+        <w:t xml:space="preserve">: Organizations shall be guided through a streamlined Onboarding Wizard covering domain DNS verification, policy definition, browser-side keypair generation, offline Organization Master Recovery Key export with test challenge, and RFC 9116 </w:t>
       </w:r>
       <w:r>
         <w:rPr>
@@ -3268,6 +3395,70 @@
           <w:sz w:val="20"/>
         </w:rPr>
         <w:t xml:space="preserve">) and launch private, invitation-only programs accessible via cryptographically tokenized invitation links.</w:t>
+      </w:r>
+    </w:p>
+    <w:p xmlns:w="http://schemas.openxmlformats.org/wordprocessingml/2006/main">
+      <w:pPr>
+        <w:spacing w:before="40" w:after="40"/>
+        <w:jc w:val="left"/>
+      </w:pPr>
+      <w:r>
+        <w:rPr>
+          <w:rFonts w:ascii="Lexend" w:hAnsi="Lexend"/>
+          <w:color w:val="222222"/>
+          <w:sz w:val="20"/>
+        </w:rPr>
+        <w:t xml:space="preserve">•  </w:t>
+      </w:r>
+      <w:r>
+        <w:rPr>
+          <w:rFonts w:ascii="Lexend" w:hAnsi="Lexend"/>
+          <w:b/>
+          <w:color w:val="222222"/>
+          <w:sz w:val="20"/>
+        </w:rPr>
+        <w:t xml:space="preserve">BR-1.6</w:t>
+      </w:r>
+      <w:r>
+        <w:rPr>
+          <w:rFonts w:ascii="Lexend" w:hAnsi="Lexend"/>
+          <w:color w:val="222222"/>
+          <w:sz w:val="20"/>
+        </w:rPr>
+        <w:t xml:space="preserve">: The platform shall provide frictionless </w:t>
+      </w:r>
+      <w:r>
+        <w:rPr>
+          <w:rFonts w:ascii="Lexend" w:hAnsi="Lexend"/>
+          <w:b/>
+          <w:color w:val="222222"/>
+          <w:sz w:val="20"/>
+        </w:rPr>
+        <w:t xml:space="preserve">Account-Less (Guest) Vulnerability Intake</w:t>
+      </w:r>
+      <w:r>
+        <w:rPr>
+          <w:rFonts w:ascii="Lexend" w:hAnsi="Lexend"/>
+          <w:color w:val="222222"/>
+          <w:sz w:val="20"/>
+        </w:rPr>
+        <w:t xml:space="preserve">: external researchers can submit vulnerability reports without registering an account. The client browser generates an ephemeral Curve25519 keypair, encrypts the report to the program defenders and organization recovery key, and provides the submitter with an opaque secret tracking URL (</w:t>
+      </w:r>
+      <w:r>
+        <w:rPr>
+          <w:rFonts w:ascii="Consolas" w:hAnsi="Consolas"/>
+          <w:color w:val="9C4146"/>
+          <w:sz w:val="20"/>
+        </w:rPr>
+        <w:t xml:space="preserve">/report/track/BBT-RPT-XXXX?token=&lt;secret&gt;</w:t>
+      </w:r>
+      <w:r>
+        <w:rPr>
+          <w:rFonts w:ascii="Lexend" w:hAnsi="Lexend"/>
+          <w:color w:val="222222"/>
+          <w:sz w:val="20"/>
+        </w:rPr>
+        <w:t xml:space="preserve">) to review replies and submit retests.</w:t>
       </w:r>
     </w:p>
     <w:p xmlns:w="http://schemas.openxmlformats.org/wordprocessingml/2006/main">
@@ -3409,23 +3600,7 @@
           <w:color w:val="222222"/>
           <w:sz w:val="20"/>
         </w:rPr>
-        <w:t xml:space="preserve"> directive pointing back to BugBountyTrack's intake portal (</w:t>
-      </w:r>
-      <w:r>
-        <w:rPr>
-          <w:rFonts w:ascii="Consolas" w:hAnsi="Consolas"/>
-          <w:color w:val="9C4146"/>
-          <w:sz w:val="20"/>
-        </w:rPr>
-        <w:t xml:space="preserve">https://bugbountytrack.com/programs/[slug]/submit</w:t>
-      </w:r>
-      <w:r>
-        <w:rPr>
-          <w:rFonts w:ascii="Lexend" w:hAnsi="Lexend"/>
-          <w:color w:val="222222"/>
-          <w:sz w:val="20"/>
-        </w:rPr>
-        <w:t xml:space="preserve">).</w:t>
+        <w:t xml:space="preserve"> directive pointing back to BugBountyTrack's intake portal.</w:t>
       </w:r>
     </w:p>
     <w:p xmlns:w="http://schemas.openxmlformats.org/wordprocessingml/2006/main">
@@ -3803,7 +3978,7 @@
           <w:color w:val="222222"/>
           <w:sz w:val="20"/>
         </w:rPr>
-        <w:t xml:space="preserve">: Encryption shall utilize a dual-recipient OpenPGP envelope encrypting the payload to the organization's designated active Decryption Custodian encryption subkey and the reporting researcher's public key.</w:t>
+        <w:t xml:space="preserve">: Encryption shall utilize an OpenPGP multi-recipient envelope encrypting the payload to the program's authorized defenders (N ≤ 10), the organization's offline master recovery key, and the reporting researcher's key (or ephemeral report key).</w:t>
       </w:r>
     </w:p>
     <w:p xmlns:w="http://schemas.openxmlformats.org/wordprocessingml/2006/main">
@@ -3865,24 +4040,7 @@
           <w:color w:val="222222"/>
           <w:sz w:val="20"/>
         </w:rPr>
-        <w:t xml:space="preserve">: Private keys shall remain strictly within client-side storage, protected by </w:t>
-      </w:r>
-      <w:r>
-        <w:rPr>
-          <w:rFonts w:ascii="Lexend" w:hAnsi="Lexend"/>
-          <w:b/>
-          <w:color w:val="222222"/>
-          <w:sz w:val="20"/>
-        </w:rPr>
-        <w:t xml:space="preserve">local encryption passphrases</w:t>
-      </w:r>
-      <w:r>
-        <w:rPr>
-          <w:rFonts w:ascii="Lexend" w:hAnsi="Lexend"/>
-          <w:color w:val="222222"/>
-          <w:sz w:val="20"/>
-        </w:rPr>
-        <w:t xml:space="preserve"> derived via PBKDF2 (iterations ≥ 100,000) and AES-GCM. The local encryption passphrase is completely distinct from the account login password and is never transmitted to the server. The platform provides owner-managed armored private key backup export/import workflows and retains historic private keys in the custodian's local keystore to decrypt past reports upon subkey rotation.</w:t>
+        <w:t xml:space="preserve">: Private keys shall remain strictly within client-side storage, protected by local encryption passphrases derived via OpenPGP native Argon2 S2K. All keys are standardized on v4 Ed25519/X25519 Curve25519 algorithms (&lt;50ms generation). RSA-4096 is deprecated and dropped to eliminate keygen stalls.</w:t>
       </w:r>
     </w:p>
     <w:p xmlns:w="http://schemas.openxmlformats.org/wordprocessingml/2006/main">
@@ -3913,7 +4071,7 @@
           <w:color w:val="222222"/>
           <w:sz w:val="20"/>
         </w:rPr>
-        <w:t xml:space="preserve">: The platform documentation shall explicitly state the browser trust boundary: client-side cryptographic isolation protects against server-side database exposure, untrusted backend administrators, and compromised database dumps; it does not protect against malware executing on the client host or browser extensions possessing permissions to modify client DOM or memory.</w:t>
+        <w:t xml:space="preserve">: The platform documentation shall explicitly state the browser trust boundary: client-side cryptographic isolation protects against server-side database exposure, untrusted backend administrators, and compromised database dumps; it assumes a modern browser environment free of malicious DOM-modifying extensions.</w:t>
       </w:r>
     </w:p>
     <w:p xmlns:w="http://schemas.openxmlformats.org/wordprocessingml/2006/main">
@@ -4022,7 +4180,7 @@
           <w:color w:val="222222"/>
           <w:sz w:val="20"/>
         </w:rPr>
-        <w:t xml:space="preserve">: The engine implementation shall be verified against the 52 canonical test vectors documented in </w:t>
+        <w:t xml:space="preserve">: The engine implementation shall be verified against the 45 canonical unique test vectors documented in </w:t>
       </w:r>
       <w:r>
         <w:rPr>
@@ -4038,7 +4196,23 @@
           <w:color w:val="222222"/>
           <w:sz w:val="20"/>
         </w:rPr>
-        <w:t xml:space="preserve"> with 100% mathematical parity.</w:t>
+        <w:t xml:space="preserve"> with 100% mathematical parity via </w:t>
+      </w:r>
+      <w:r>
+        <w:rPr>
+          <w:rFonts w:ascii="Consolas" w:hAnsi="Consolas"/>
+          <w:color w:val="9C4146"/>
+          <w:sz w:val="20"/>
+        </w:rPr>
+        <w:t xml:space="preserve">verify_cvss_engine.py</w:t>
+      </w:r>
+      <w:r>
+        <w:rPr>
+          <w:rFonts w:ascii="Lexend" w:hAnsi="Lexend"/>
+          <w:color w:val="222222"/>
+          <w:sz w:val="20"/>
+        </w:rPr>
+        <w:t xml:space="preserve">.</w:t>
       </w:r>
     </w:p>
     <w:p xmlns:w="http://schemas.openxmlformats.org/wordprocessingml/2006/main">
@@ -4069,7 +4243,39 @@
           <w:color w:val="222222"/>
           <w:sz w:val="20"/>
         </w:rPr>
-        <w:t xml:space="preserve">: For every severity assessment, the platform shall immutably record the full vector string, calculated score, assessor identity, and a textual justification to resolve potential severity disputes.</w:t>
+        <w:t xml:space="preserve">: For every report, the schema shall decouple the researcher-suggested score (</w:t>
+      </w:r>
+      <w:r>
+        <w:rPr>
+          <w:rFonts w:ascii="Consolas" w:hAnsi="Consolas"/>
+          <w:color w:val="9C4146"/>
+          <w:sz w:val="20"/>
+        </w:rPr>
+        <w:t xml:space="preserve">cvss_suggested</w:t>
+      </w:r>
+      <w:r>
+        <w:rPr>
+          <w:rFonts w:ascii="Lexend" w:hAnsi="Lexend"/>
+          <w:color w:val="222222"/>
+          <w:sz w:val="20"/>
+        </w:rPr>
+        <w:t xml:space="preserve">) from the defender-assigned official score (</w:t>
+      </w:r>
+      <w:r>
+        <w:rPr>
+          <w:rFonts w:ascii="Consolas" w:hAnsi="Consolas"/>
+          <w:color w:val="9C4146"/>
+          <w:sz w:val="20"/>
+        </w:rPr>
+        <w:t xml:space="preserve">cvss_score</w:t>
+      </w:r>
+      <w:r>
+        <w:rPr>
+          <w:rFonts w:ascii="Lexend" w:hAnsi="Lexend"/>
+          <w:color w:val="222222"/>
+          <w:sz w:val="20"/>
+        </w:rPr>
+        <w:t xml:space="preserve">), recording assessor identity and textual justification.</w:t>
       </w:r>
     </w:p>
     <w:p xmlns:w="http://schemas.openxmlformats.org/wordprocessingml/2006/main">
@@ -4116,7 +4322,7 @@
           <w:color w:val="222222"/>
           <w:sz w:val="20"/>
         </w:rPr>
-        <w:t xml:space="preserve">: Authorized reviewers (designated Decryption Custodians) shall decrypt vulnerability payloads in-browser upon providing their local encryption passphrase.</w:t>
+        <w:t xml:space="preserve">: Authorized reviewers shall decrypt vulnerability payloads in-browser upon unlocking their local private key.</w:t>
       </w:r>
     </w:p>
     <w:p xmlns:w="http://schemas.openxmlformats.org/wordprocessingml/2006/main">
@@ -4178,7 +4384,7 @@
           <w:color w:val="222222"/>
           <w:sz w:val="20"/>
         </w:rPr>
-        <w:t xml:space="preserve">: Confidential threaded messages encrypted for both Hunter and Defender.</w:t>
+        <w:t xml:space="preserve">: Confidential threaded messages encrypted for Submitter + Program Defenders + Org Recovery Key.</w:t>
       </w:r>
     </w:p>
     <w:p xmlns:w="http://schemas.openxmlformats.org/wordprocessingml/2006/main">
@@ -4209,7 +4415,7 @@
           <w:color w:val="222222"/>
           <w:sz w:val="20"/>
         </w:rPr>
-        <w:t xml:space="preserve">: Private notes encrypted exclusively for the organization custodian's key, completely inaccessible to the researcher.</w:t>
+        <w:t xml:space="preserve">: Private notes encrypted exclusively for Program Defenders + Org Recovery Key, completely inaccessible to the researcher.</w:t>
       </w:r>
     </w:p>
     <w:p xmlns:w="http://schemas.openxmlformats.org/wordprocessingml/2006/main">
@@ -4240,7 +4446,7 @@
           <w:color w:val="222222"/>
           <w:sz w:val="20"/>
         </w:rPr>
-        <w:t xml:space="preserve">: Outbound notifications (via email or webhooks) shall convey operational metadata only (e.g., "New update on Report #BBT-104 [AUTHENTICATION_BYPASS]") with an authenticated link, never transmitting exploit details over external notification rails.</w:t>
+        <w:t xml:space="preserve">: Outbound notifications (via email or Slack-compatible webhooks) shall convey operational metadata only (e.g., "New update on Report #BBT-104 [AUTHENTICATION_BYPASS]") with an authenticated link, never transmitting exploit details over external notification rails.</w:t>
       </w:r>
     </w:p>
     <w:p xmlns:w="http://schemas.openxmlformats.org/wordprocessingml/2006/main">
@@ -4271,7 +4477,7 @@
           <w:color w:val="222222"/>
           <w:sz w:val="20"/>
         </w:rPr>
-        <w:t xml:space="preserve">: The system shall track SLA countdown timers based on severity (e.g., Critical: 48h initial triage, 14d fix; High: 72h triage, 30d fix), displaying visual alerts and dispatching automated reminder emails when deadlines approach.</w:t>
+        <w:t xml:space="preserve">: The system shall track SLA countdown timers based on severity (Critical: 48h initial triage, 14d fix; High: 72h triage, 30d fix), displaying visual alerts and dispatching automated reminders via hourly scheduled checks.</w:t>
       </w:r>
     </w:p>
     <w:p xmlns:w="http://schemas.openxmlformats.org/wordprocessingml/2006/main">
@@ -4380,23 +4586,7 @@
           <w:color w:val="222222"/>
           <w:sz w:val="20"/>
         </w:rPr>
-        <w:t xml:space="preserve">: For code fixes, the platform shall query the GitHub REST API v3 (</w:t>
-      </w:r>
-      <w:r>
-        <w:rPr>
-          <w:rFonts w:ascii="Consolas" w:hAnsi="Consolas"/>
-          <w:color w:val="9C4146"/>
-          <w:sz w:val="20"/>
-        </w:rPr>
-        <w:t xml:space="preserve">GET /repos/{owner/{repo/commits/{ref</w:t>
-      </w:r>
-      <w:r>
-        <w:rPr>
-          <w:rFonts w:ascii="Lexend" w:hAnsi="Lexend"/>
-          <w:color w:val="222222"/>
-          <w:sz w:val="20"/>
-        </w:rPr>
-        <w:t xml:space="preserve">) using an organization-provided GitHub token or GitHub App installation to verify that the referenced 40-character commit SHA exists and confirm its presence on the target repository branch across public or private repositories.</w:t>
+        <w:t xml:space="preserve">: For code fixes, the platform shall query the GitHub REST API v3 to verify that the referenced commit SHA exists and confirm its inclusion on the target repository branch using the GitHub compare API across public or private repositories (with organization Personal Access Tokens encrypted at rest).</w:t>
       </w:r>
     </w:p>
     <w:p xmlns:w="http://schemas.openxmlformats.org/wordprocessingml/2006/main">
@@ -4566,7 +4756,7 @@
           <w:color w:val="222222"/>
           <w:sz w:val="20"/>
         </w:rPr>
-        <w:t xml:space="preserve"> (requesting researcher clarification), </w:t>
+        <w:t xml:space="preserve"> (with automated 14-day inactivity timeout), </w:t>
       </w:r>
       <w:r>
         <w:rPr>
@@ -4574,7 +4764,7 @@
           <w:color w:val="9C4146"/>
           <w:sz w:val="20"/>
         </w:rPr>
-        <w:t xml:space="preserve">REJECTED</w:t>
+        <w:t xml:space="preserve">REJECTED_SPAM</w:t>
       </w:r>
       <w:r>
         <w:rPr>
@@ -4582,7 +4772,7 @@
           <w:color w:val="222222"/>
           <w:sz w:val="20"/>
         </w:rPr>
-        <w:t xml:space="preserve"> (out-of-scope or invalid), and </w:t>
+        <w:t xml:space="preserve"> (direct closure of noise from </w:t>
       </w:r>
       <w:r>
         <w:rPr>
@@ -4590,7 +4780,7 @@
           <w:color w:val="9C4146"/>
           <w:sz w:val="20"/>
         </w:rPr>
-        <w:t xml:space="preserve">DUPLICATE</w:t>
+        <w:t xml:space="preserve">NEW</w:t>
       </w:r>
       <w:r>
         <w:rPr>
@@ -4598,7 +4788,39 @@
           <w:color w:val="222222"/>
           <w:sz w:val="20"/>
         </w:rPr>
-        <w:t xml:space="preserve"> (internally linked).</w:t>
+        <w:t xml:space="preserve">), </w:t>
+      </w:r>
+      <w:r>
+        <w:rPr>
+          <w:rFonts w:ascii="Consolas" w:hAnsi="Consolas"/>
+          <w:color w:val="9C4146"/>
+          <w:sz w:val="20"/>
+        </w:rPr>
+        <w:t xml:space="preserve">REJECTED_INVALID</w:t>
+      </w:r>
+      <w:r>
+        <w:rPr>
+          <w:rFonts w:ascii="Lexend" w:hAnsi="Lexend"/>
+          <w:color w:val="222222"/>
+          <w:sz w:val="20"/>
+        </w:rPr>
+        <w:t xml:space="preserve">, and </w:t>
+      </w:r>
+      <w:r>
+        <w:rPr>
+          <w:rFonts w:ascii="Consolas" w:hAnsi="Consolas"/>
+          <w:color w:val="9C4146"/>
+          <w:sz w:val="20"/>
+        </w:rPr>
+        <w:t xml:space="preserve">DUPLICATE</w:t>
+      </w:r>
+      <w:r>
+        <w:rPr>
+          <w:rFonts w:ascii="Lexend" w:hAnsi="Lexend"/>
+          <w:color w:val="222222"/>
+          <w:sz w:val="20"/>
+        </w:rPr>
+        <w:t xml:space="preserve">.</w:t>
       </w:r>
     </w:p>
     <w:p xmlns:w="http://schemas.openxmlformats.org/wordprocessingml/2006/main">
@@ -4783,7 +5005,7 @@
           <w:color w:val="222222"/>
           <w:sz w:val="20"/>
         </w:rPr>
-        <w:t xml:space="preserve">: If retesting reveals that the vulnerability persists, the state transition shall record a </w:t>
+        <w:t xml:space="preserve">: Additional terminal states include </w:t>
       </w:r>
       <w:r>
         <w:rPr>
@@ -4791,7 +5013,7 @@
           <w:color w:val="9C4146"/>
           <w:sz w:val="20"/>
         </w:rPr>
-        <w:t xml:space="preserve">RETEST_FAILED</w:t>
+        <w:t xml:space="preserve">RISK_ACCEPTED</w:t>
       </w:r>
       <w:r>
         <w:rPr>
@@ -4799,7 +5021,7 @@
           <w:color w:val="222222"/>
           <w:sz w:val="20"/>
         </w:rPr>
-        <w:t xml:space="preserve"> audit event and return to </w:t>
+        <w:t xml:space="preserve"> (formal organizational acceptance of operational risk without code modification) and </w:t>
       </w:r>
       <w:r>
         <w:rPr>
@@ -4807,7 +5029,7 @@
           <w:color w:val="9C4146"/>
           <w:sz w:val="20"/>
         </w:rPr>
-        <w:t xml:space="preserve">ACCEPTED</w:t>
+        <w:t xml:space="preserve">WITHDRAWN</w:t>
       </w:r>
       <w:r>
         <w:rPr>
@@ -4815,7 +5037,7 @@
           <w:color w:val="222222"/>
           <w:sz w:val="20"/>
         </w:rPr>
-        <w:t xml:space="preserve">, preserving the failed retest evidence in the immutable audit log.</w:t>
+        <w:t xml:space="preserve"> (researcher self-retraction).</w:t>
       </w:r>
     </w:p>
     <w:p xmlns:w="http://schemas.openxmlformats.org/wordprocessingml/2006/main">
@@ -4846,7 +5068,7 @@
           <w:color w:val="222222"/>
           <w:sz w:val="20"/>
         </w:rPr>
-        <w:t xml:space="preserve">: Reopening any closed report (</w:t>
+        <w:t xml:space="preserve">: If retesting reveals that the vulnerability persists, the state transition shall record a </w:t>
       </w:r>
       <w:r>
         <w:rPr>
@@ -4854,7 +5076,7 @@
           <w:color w:val="9C4146"/>
           <w:sz w:val="20"/>
         </w:rPr>
-        <w:t xml:space="preserve">VERIFIED_RESEARCHER</w:t>
+        <w:t xml:space="preserve">RETEST_FAILED</w:t>
       </w:r>
       <w:r>
         <w:rPr>
@@ -4862,7 +5084,7 @@
           <w:color w:val="222222"/>
           <w:sz w:val="20"/>
         </w:rPr>
-        <w:t xml:space="preserve">, </w:t>
+        <w:t xml:space="preserve"> audit event and return to </w:t>
       </w:r>
       <w:r>
         <w:rPr>
@@ -4870,7 +5092,7 @@
           <w:color w:val="9C4146"/>
           <w:sz w:val="20"/>
         </w:rPr>
-        <w:t xml:space="preserve">VERIFIED_INTERNAL</w:t>
+        <w:t xml:space="preserve">ACCEPTED</w:t>
       </w:r>
       <w:r>
         <w:rPr>
@@ -4878,71 +5100,7 @@
           <w:color w:val="222222"/>
           <w:sz w:val="20"/>
         </w:rPr>
-        <w:t xml:space="preserve">, </w:t>
-      </w:r>
-      <w:r>
-        <w:rPr>
-          <w:rFonts w:ascii="Consolas" w:hAnsi="Consolas"/>
-          <w:color w:val="9C4146"/>
-          <w:sz w:val="20"/>
-        </w:rPr>
-        <w:t xml:space="preserve">CLOSED_UNVERIFIED_TIMEOUT</w:t>
-      </w:r>
-      <w:r>
-        <w:rPr>
-          <w:rFonts w:ascii="Lexend" w:hAnsi="Lexend"/>
-          <w:color w:val="222222"/>
-          <w:sz w:val="20"/>
-        </w:rPr>
-        <w:t xml:space="preserve">, </w:t>
-      </w:r>
-      <w:r>
-        <w:rPr>
-          <w:rFonts w:ascii="Consolas" w:hAnsi="Consolas"/>
-          <w:color w:val="9C4146"/>
-          <w:sz w:val="20"/>
-        </w:rPr>
-        <w:t xml:space="preserve">REJECTED</w:t>
-      </w:r>
-      <w:r>
-        <w:rPr>
-          <w:rFonts w:ascii="Lexend" w:hAnsi="Lexend"/>
-          <w:color w:val="222222"/>
-          <w:sz w:val="20"/>
-        </w:rPr>
-        <w:t xml:space="preserve">, </w:t>
-      </w:r>
-      <w:r>
-        <w:rPr>
-          <w:rFonts w:ascii="Consolas" w:hAnsi="Consolas"/>
-          <w:color w:val="9C4146"/>
-          <w:sz w:val="20"/>
-        </w:rPr>
-        <w:t xml:space="preserve">DUPLICATE</w:t>
-      </w:r>
-      <w:r>
-        <w:rPr>
-          <w:rFonts w:ascii="Lexend" w:hAnsi="Lexend"/>
-          <w:color w:val="222222"/>
-          <w:sz w:val="20"/>
-        </w:rPr>
-        <w:t xml:space="preserve">) shall require an authorized Defender or Tenant Owner action recording an immutable justification log, transitioning the ticket back to </w:t>
-      </w:r>
-      <w:r>
-        <w:rPr>
-          <w:rFonts w:ascii="Consolas" w:hAnsi="Consolas"/>
-          <w:color w:val="9C4146"/>
-          <w:sz w:val="20"/>
-        </w:rPr>
-        <w:t xml:space="preserve">TRIAGING</w:t>
-      </w:r>
-      <w:r>
-        <w:rPr>
-          <w:rFonts w:ascii="Lexend" w:hAnsi="Lexend"/>
-          <w:color w:val="222222"/>
-          <w:sz w:val="20"/>
-        </w:rPr>
-        <w:t xml:space="preserve">.</w:t>
+        <w:t xml:space="preserve">, preserving the failed retest evidence in the immutable audit log.</w:t>
       </w:r>
     </w:p>
     <w:p xmlns:w="http://schemas.openxmlformats.org/wordprocessingml/2006/main">
@@ -4973,7 +5131,54 @@
           <w:color w:val="222222"/>
           <w:sz w:val="20"/>
         </w:rPr>
-        <w:t xml:space="preserve">: The platform shall generate exportable Redacted Closure Evidence summaries (PDF and JSON/HTML format) capturing the operational label, report lifecycle timestamps, verified commit SHA/branch, deployment environment, retest attestations, and closing officer identity, suitable for sharing with enterprise clients and security auditors without disclosing raw exploit instructions.</w:t>
+        <w:t xml:space="preserve">: Reopening any closed report shall require an authorized Defender or Tenant Owner action recording an immutable justification log, transitioning the ticket back to </w:t>
+      </w:r>
+      <w:r>
+        <w:rPr>
+          <w:rFonts w:ascii="Consolas" w:hAnsi="Consolas"/>
+          <w:color w:val="9C4146"/>
+          <w:sz w:val="20"/>
+        </w:rPr>
+        <w:t xml:space="preserve">TRIAGING</w:t>
+      </w:r>
+      <w:r>
+        <w:rPr>
+          <w:rFonts w:ascii="Lexend" w:hAnsi="Lexend"/>
+          <w:color w:val="222222"/>
+          <w:sz w:val="20"/>
+        </w:rPr>
+        <w:t xml:space="preserve">.</w:t>
+      </w:r>
+    </w:p>
+    <w:p xmlns:w="http://schemas.openxmlformats.org/wordprocessingml/2006/main">
+      <w:pPr>
+        <w:spacing w:before="40" w:after="40"/>
+        <w:jc w:val="left"/>
+      </w:pPr>
+      <w:r>
+        <w:rPr>
+          <w:rFonts w:ascii="Lexend" w:hAnsi="Lexend"/>
+          <w:color w:val="222222"/>
+          <w:sz w:val="20"/>
+        </w:rPr>
+        <w:t xml:space="preserve">•  </w:t>
+      </w:r>
+      <w:r>
+        <w:rPr>
+          <w:rFonts w:ascii="Lexend" w:hAnsi="Lexend"/>
+          <w:b/>
+          <w:color w:val="222222"/>
+          <w:sz w:val="20"/>
+        </w:rPr>
+        <w:t xml:space="preserve">BR-7.7</w:t>
+      </w:r>
+      <w:r>
+        <w:rPr>
+          <w:rFonts w:ascii="Lexend" w:hAnsi="Lexend"/>
+          <w:color w:val="222222"/>
+          <w:sz w:val="20"/>
+        </w:rPr>
+        <w:t xml:space="preserve">: The platform shall generate exportable Redacted Closure Evidence summaries (PDF and JSON format) capturing the operational label, report lifecycle timestamps, verified commit SHA/branch, deployment environment, retest attestations, and closing officer identity, suitable for sharing with enterprise clients and security auditors without disclosing raw exploit instructions.</w:t>
       </w:r>
     </w:p>
     <w:p xmlns:w="http://schemas.openxmlformats.org/wordprocessingml/2006/main">
@@ -5099,7 +5304,23 @@
           <w:color w:val="222222"/>
           <w:sz w:val="20"/>
         </w:rPr>
-        <w:t xml:space="preserve">: The platform shall enforce database-level Row-Level Security (RLS) in PostgreSQL, dynamically scoping connection queries to the authenticated tenant context.</w:t>
+        <w:t xml:space="preserve">: The platform shall enforce database-level Row-Level Security (RLS) in PostgreSQL, dynamically scoping connection queries to the authenticated tenant context within interactive transactions (</w:t>
+      </w:r>
+      <w:r>
+        <w:rPr>
+          <w:rFonts w:ascii="Consolas" w:hAnsi="Consolas"/>
+          <w:color w:val="9C4146"/>
+          <w:sz w:val="20"/>
+        </w:rPr>
+        <w:t xml:space="preserve">SET LOCAL app.current_tenant_id</w:t>
+      </w:r>
+      <w:r>
+        <w:rPr>
+          <w:rFonts w:ascii="Lexend" w:hAnsi="Lexend"/>
+          <w:color w:val="222222"/>
+          <w:sz w:val="20"/>
+        </w:rPr>
+        <w:t xml:space="preserve">).</w:t>
       </w:r>
     </w:p>
     <w:p xmlns:w="http://schemas.openxmlformats.org/wordprocessingml/2006/main">
@@ -5130,7 +5351,7 @@
           <w:color w:val="222222"/>
           <w:sz w:val="20"/>
         </w:rPr>
-        <w:t xml:space="preserve">: Public report submission endpoints shall be protected by token-bucket rate limiting (5 submissions / hour / IP) to mitigate automated denial-of-service and scanner spam.</w:t>
+        <w:t xml:space="preserve">: Public report submission endpoints shall be protected by shared store rate limiting (Postgres / Upstash) and Cloudflare Turnstile CAPTCHA (5 submissions / hour / IP).</w:t>
       </w:r>
     </w:p>
     <w:p xmlns:w="http://schemas.openxmlformats.org/wordprocessingml/2006/main">
@@ -5161,7 +5382,23 @@
           <w:color w:val="222222"/>
           <w:sz w:val="20"/>
         </w:rPr>
-        <w:t xml:space="preserve">: The platform shall enforce storage quotas to protect shared infrastructure: in the academic demonstration baseline, quotas are configured at 50 MB database volume on PostgreSQL and 2 GB encrypted object storage on Cloudflare R2 per tenant organization (bounding total multi-tenant demo volume across 5 tenants within 250 MB database and 10 GB object storage limits). In commercial production, per-tenant quotas correspond to subscription tier entitlements (10 GB for Starter, 50 GB for Team/Pro). The platform shall issue an administrative warning when organization storage usage reaches 90% of the configured quota, and strictly reject any new upload or report allocation that would cause total storage to exceed 100% (HTTP 413 Payload Too Large).</w:t>
+        <w:t xml:space="preserve">: Attachments up to 25 MB shall be uploaded directly from the browser to Cloudflare R2 using presigned URLs requested from </w:t>
+      </w:r>
+      <w:r>
+        <w:rPr>
+          <w:rFonts w:ascii="Consolas" w:hAnsi="Consolas"/>
+          <w:color w:val="9C4146"/>
+          <w:sz w:val="20"/>
+        </w:rPr>
+        <w:t xml:space="preserve">/api/uploads/presign</w:t>
+      </w:r>
+      <w:r>
+        <w:rPr>
+          <w:rFonts w:ascii="Lexend" w:hAnsi="Lexend"/>
+          <w:color w:val="222222"/>
+          <w:sz w:val="20"/>
+        </w:rPr>
+        <w:t xml:space="preserve">, bypassing serverless function payload size ceilings. Quotas (2 GB demo, 10 GB Team) shall be validated at URL issuance time, and unconfirmed uploads shall be cleaned up by an automated orphan cleanup job.</w:t>
       </w:r>
     </w:p>
     <w:p xmlns:w="http://schemas.openxmlformats.org/wordprocessingml/2006/main">
@@ -5192,7 +5429,23 @@
           <w:color w:val="222222"/>
           <w:sz w:val="20"/>
         </w:rPr>
-        <w:t xml:space="preserve">: The audit ledger shall enforce strict append-only constraints: database permissions on </w:t>
+        <w:t xml:space="preserve">: The audit ledger shall enforce strict append-only constraints with a SHA-256 </w:t>
+      </w:r>
+      <w:r>
+        <w:rPr>
+          <w:rFonts w:ascii="Consolas" w:hAnsi="Consolas"/>
+          <w:color w:val="9C4146"/>
+          <w:sz w:val="20"/>
+        </w:rPr>
+        <w:t xml:space="preserve">prev_hash</w:t>
+      </w:r>
+      <w:r>
+        <w:rPr>
+          <w:rFonts w:ascii="Lexend" w:hAnsi="Lexend"/>
+          <w:color w:val="222222"/>
+          <w:sz w:val="20"/>
+        </w:rPr>
+        <w:t xml:space="preserve"> cryptographic chain: database permissions on </w:t>
       </w:r>
       <w:r>
         <w:rPr>
@@ -5325,7 +5578,7 @@
           <w:color w:val="222222"/>
           <w:sz w:val="20"/>
         </w:rPr>
-        <w:t xml:space="preserve">No Real-Money Financial Payout Escrow in MVP</w:t>
+        <w:t xml:space="preserve">No Direct Banking Payout Rails in MVP</w:t>
       </w:r>
       <w:r>
         <w:rPr>
@@ -5333,7 +5586,7 @@
           <w:color w:val="222222"/>
           <w:sz w:val="20"/>
         </w:rPr>
-        <w:t xml:space="preserve">: The initial launch omits real-money banking payout rails (Stripe Connect, ACH, SEPA) and tax compliance (W-8BEN / W-9 forms). If demonstration awards are shown, they shall be modeled as explicitly simulated credit/point records.</w:t>
+        <w:t xml:space="preserve">: The initial launch omits real-money banking payout rails (Stripe Connect, ACH, SEPA) and tax compliance forms (W-8BEN / W-9). If demonstration awards are shown, they shall be modeled as explicitly simulated credit/point records.</w:t>
       </w:r>
     </w:p>
     <w:p xmlns:w="http://schemas.openxmlformats.org/wordprocessingml/2006/main">
@@ -5642,7 +5895,7 @@
           <w:color w:val="222222"/>
           <w:sz w:val="20"/>
         </w:rPr>
-        <w:t xml:space="preserve">: Every closed report shall have a recorded closure category and justification. Only successfully retested reports shall be labeled verified. Rejected, duplicate, and unverified-timeout outcomes shall be reported separately.</w:t>
+        <w:t xml:space="preserve">: Every closed report shall have a recorded closure category and justification. Only successfully retested reports shall be labeled verified. Rejected, duplicate, risk-accepted, and unverified-timeout outcomes shall be reported separately.</w:t>
       </w:r>
     </w:p>
     <w:p xmlns:w="http://schemas.openxmlformats.org/wordprocessingml/2006/main">
@@ -6525,7 +6778,7 @@
           <w:color w:val="222222"/>
           <w:sz w:val="20"/>
         </w:rPr>
-        <w:t xml:space="preserve">When transitioning to paid commercial operations serving early B2B customers, the infrastructure shifts to commercially supported tiers with dedicated SLAs and custom domain support:</w:t>
+        <w:t xml:space="preserve">When transitioning to paid commercial operations serving early B2B customers, the infrastructure shifts to commercially supported tiers with dedicated SLAs, custom domains, and hourly crons:</w:t>
       </w:r>
     </w:p>
     <w:tbl xmlns:w="http://schemas.openxmlformats.org/wordprocessingml/2006/main">
@@ -6542,10 +6795,10 @@
         </w:tblBorders>
       </w:tblPr>
       <w:tblGrid>
-        <w:gridCol w:w="2176"/>
+        <w:gridCol w:w="2117"/>
         <w:gridCol w:w="1200"/>
-        <w:gridCol w:w="1674"/>
-        <w:gridCol w:w="3851"/>
+        <w:gridCol w:w="1520"/>
+        <w:gridCol w:w="4126"/>
         <w:gridCol w:w="1200"/>
       </w:tblGrid>
       <w:tr>
@@ -6554,7 +6807,7 @@
         </w:trPr>
         <w:tc>
           <w:tcPr>
-            <w:tcW w:w="2176" w:type="dxa"/>
+            <w:tcW w:w="2117" w:type="dxa"/>
             <w:shd w:val="clear" w:fill="E3EFCB"/>
             <w:tcMar>
               <w:top w:w="80" w:type="dxa"/>
@@ -6608,7 +6861,7 @@
         </w:tc>
         <w:tc>
           <w:tcPr>
-            <w:tcW w:w="1674" w:type="dxa"/>
+            <w:tcW w:w="1520" w:type="dxa"/>
             <w:shd w:val="clear" w:fill="E3EFCB"/>
             <w:tcMar>
               <w:top w:w="80" w:type="dxa"/>
@@ -6635,7 +6888,7 @@
         </w:tc>
         <w:tc>
           <w:tcPr>
-            <w:tcW w:w="3851" w:type="dxa"/>
+            <w:tcW w:w="4126" w:type="dxa"/>
             <w:shd w:val="clear" w:fill="E3EFCB"/>
             <w:tcMar>
               <w:top w:w="80" w:type="dxa"/>
@@ -6691,7 +6944,7 @@
       <w:tr>
         <w:tc>
           <w:tcPr>
-            <w:tcW w:w="2176" w:type="dxa"/>
+            <w:tcW w:w="2117" w:type="dxa"/>
             <w:tcMar>
               <w:top w:w="60" w:type="dxa"/>
               <w:bottom w:w="60" w:type="dxa"/>
@@ -6742,7 +6995,7 @@
         </w:tc>
         <w:tc>
           <w:tcPr>
-            <w:tcW w:w="1674" w:type="dxa"/>
+            <w:tcW w:w="1520" w:type="dxa"/>
             <w:tcMar>
               <w:top w:w="60" w:type="dxa"/>
               <w:bottom w:w="60" w:type="dxa"/>
@@ -6767,7 +7020,7 @@
         </w:tc>
         <w:tc>
           <w:tcPr>
-            <w:tcW w:w="3851" w:type="dxa"/>
+            <w:tcW w:w="4126" w:type="dxa"/>
             <w:tcMar>
               <w:top w:w="60" w:type="dxa"/>
               <w:bottom w:w="60" w:type="dxa"/>
@@ -6786,7 +7039,7 @@
                 <w:color w:val="222222"/>
                 <w:sz w:val="18"/>
               </w:rPr>
-              <w:t xml:space="preserve">Commercial SLA, edge caching, zero cold starts, team collaboration</w:t>
+              <w:t xml:space="preserve">Commercial license, hourly SLA crons, zero cold starts</w:t>
             </w:r>
           </w:p>
         </w:tc>
@@ -6820,7 +7073,7 @@
       <w:tr>
         <w:tc>
           <w:tcPr>
-            <w:tcW w:w="2176" w:type="dxa"/>
+            <w:tcW w:w="2117" w:type="dxa"/>
             <w:shd w:val="clear" w:fill="F9FBF6"/>
             <w:tcMar>
               <w:top w:w="60" w:type="dxa"/>
@@ -6873,7 +7126,7 @@
         </w:tc>
         <w:tc>
           <w:tcPr>
-            <w:tcW w:w="1674" w:type="dxa"/>
+            <w:tcW w:w="1520" w:type="dxa"/>
             <w:shd w:val="clear" w:fill="F9FBF6"/>
             <w:tcMar>
               <w:top w:w="60" w:type="dxa"/>
@@ -6899,7 +7152,7 @@
         </w:tc>
         <w:tc>
           <w:tcPr>
-            <w:tcW w:w="3851" w:type="dxa"/>
+            <w:tcW w:w="4126" w:type="dxa"/>
             <w:shd w:val="clear" w:fill="F9FBF6"/>
             <w:tcMar>
               <w:top w:w="60" w:type="dxa"/>
@@ -6954,7 +7207,7 @@
       <w:tr>
         <w:tc>
           <w:tcPr>
-            <w:tcW w:w="2176" w:type="dxa"/>
+            <w:tcW w:w="2117" w:type="dxa"/>
             <w:tcMar>
               <w:top w:w="60" w:type="dxa"/>
               <w:bottom w:w="60" w:type="dxa"/>
@@ -7005,7 +7258,7 @@
         </w:tc>
         <w:tc>
           <w:tcPr>
-            <w:tcW w:w="1674" w:type="dxa"/>
+            <w:tcW w:w="1520" w:type="dxa"/>
             <w:tcMar>
               <w:top w:w="60" w:type="dxa"/>
               <w:bottom w:w="60" w:type="dxa"/>
@@ -7030,7 +7283,7 @@
         </w:tc>
         <w:tc>
           <w:tcPr>
-            <w:tcW w:w="3851" w:type="dxa"/>
+            <w:tcW w:w="4126" w:type="dxa"/>
             <w:tcMar>
               <w:top w:w="60" w:type="dxa"/>
               <w:bottom w:w="60" w:type="dxa"/>
@@ -7083,7 +7336,7 @@
       <w:tr>
         <w:tc>
           <w:tcPr>
-            <w:tcW w:w="2176" w:type="dxa"/>
+            <w:tcW w:w="2117" w:type="dxa"/>
             <w:shd w:val="clear" w:fill="F9FBF6"/>
             <w:tcMar>
               <w:top w:w="60" w:type="dxa"/>
@@ -7136,7 +7389,7 @@
         </w:tc>
         <w:tc>
           <w:tcPr>
-            <w:tcW w:w="1674" w:type="dxa"/>
+            <w:tcW w:w="1520" w:type="dxa"/>
             <w:shd w:val="clear" w:fill="F9FBF6"/>
             <w:tcMar>
               <w:top w:w="60" w:type="dxa"/>
@@ -7162,7 +7415,7 @@
         </w:tc>
         <w:tc>
           <w:tcPr>
-            <w:tcW w:w="3851" w:type="dxa"/>
+            <w:tcW w:w="4126" w:type="dxa"/>
             <w:shd w:val="clear" w:fill="F9FBF6"/>
             <w:tcMar>
               <w:top w:w="60" w:type="dxa"/>
@@ -7217,7 +7470,7 @@
       <w:tr>
         <w:tc>
           <w:tcPr>
-            <w:tcW w:w="2176" w:type="dxa"/>
+            <w:tcW w:w="2117" w:type="dxa"/>
             <w:tcMar>
               <w:top w:w="60" w:type="dxa"/>
               <w:bottom w:w="60" w:type="dxa"/>
@@ -7268,7 +7521,7 @@
         </w:tc>
         <w:tc>
           <w:tcPr>
-            <w:tcW w:w="1674" w:type="dxa"/>
+            <w:tcW w:w="1520" w:type="dxa"/>
             <w:tcMar>
               <w:top w:w="60" w:type="dxa"/>
               <w:bottom w:w="60" w:type="dxa"/>
@@ -7317,7 +7570,7 @@
         </w:tc>
         <w:tc>
           <w:tcPr>
-            <w:tcW w:w="3851" w:type="dxa"/>
+            <w:tcW w:w="4126" w:type="dxa"/>
             <w:tcMar>
               <w:top w:w="60" w:type="dxa"/>
               <w:bottom w:w="60" w:type="dxa"/>
@@ -7370,7 +7623,7 @@
       <w:tr>
         <w:tc>
           <w:tcPr>
-            <w:tcW w:w="2176" w:type="dxa"/>
+            <w:tcW w:w="2117" w:type="dxa"/>
             <w:shd w:val="clear" w:fill="F9FBF6"/>
             <w:tcMar>
               <w:top w:w="60" w:type="dxa"/>
@@ -7391,7 +7644,7 @@
                 <w:color w:val="222222"/>
                 <w:sz w:val="18"/>
               </w:rPr>
-              <w:t xml:space="preserve">Payment Gateway</w:t>
+              <w:t xml:space="preserve">Merchant of Record Gateway</w:t>
             </w:r>
           </w:p>
         </w:tc>
@@ -7417,13 +7670,13 @@
                 <w:color w:val="222222"/>
                 <w:sz w:val="18"/>
               </w:rPr>
-              <w:t xml:space="preserve">Stripe Billing</w:t>
+              <w:t xml:space="preserve">Lemon Squeezy</w:t>
             </w:r>
           </w:p>
         </w:tc>
         <w:tc>
           <w:tcPr>
-            <w:tcW w:w="1674" w:type="dxa"/>
+            <w:tcW w:w="1520" w:type="dxa"/>
             <w:shd w:val="clear" w:fill="F9FBF6"/>
             <w:tcMar>
               <w:top w:w="60" w:type="dxa"/>
@@ -7443,13 +7696,13 @@
                 <w:color w:val="222222"/>
                 <w:sz w:val="18"/>
               </w:rPr>
-              <w:t xml:space="preserve">Automated invoicing &amp; checkout</w:t>
+              <w:t xml:space="preserve">MoR Billing &amp; Global Tax</w:t>
             </w:r>
           </w:p>
         </w:tc>
         <w:tc>
           <w:tcPr>
-            <w:tcW w:w="3851" w:type="dxa"/>
+            <w:tcW w:w="4126" w:type="dxa"/>
             <w:shd w:val="clear" w:fill="F9FBF6"/>
             <w:tcMar>
               <w:top w:w="60" w:type="dxa"/>
@@ -7469,7 +7722,7 @@
                 <w:color w:val="222222"/>
                 <w:sz w:val="18"/>
               </w:rPr>
-              <w:t xml:space="preserve">2.9% + $0.30 per transaction</w:t>
+              <w:t xml:space="preserve">Handles global VAT, sales tax, direct bank payouts to Pakistan (5% + 50¢/tx)</w:t>
             </w:r>
           </w:p>
         </w:tc>
@@ -7504,7 +7757,7 @@
       <w:tr>
         <w:tc>
           <w:tcPr>
-            <w:tcW w:w="2176" w:type="dxa"/>
+            <w:tcW w:w="2117" w:type="dxa"/>
             <w:tcMar>
               <w:top w:w="60" w:type="dxa"/>
               <w:bottom w:w="60" w:type="dxa"/>
@@ -7555,7 +7808,7 @@
         </w:tc>
         <w:tc>
           <w:tcPr>
-            <w:tcW w:w="1674" w:type="dxa"/>
+            <w:tcW w:w="1520" w:type="dxa"/>
             <w:tcMar>
               <w:top w:w="60" w:type="dxa"/>
               <w:bottom w:w="60" w:type="dxa"/>
@@ -7580,7 +7833,7 @@
         </w:tc>
         <w:tc>
           <w:tcPr>
-            <w:tcW w:w="3851" w:type="dxa"/>
+            <w:tcW w:w="4126" w:type="dxa"/>
             <w:tcMar>
               <w:top w:w="60" w:type="dxa"/>
               <w:bottom w:w="60" w:type="dxa"/>
@@ -7665,7 +7918,7 @@
           <w:color w:val="222222"/>
           <w:sz w:val="20"/>
         </w:rPr>
-        <w:t xml:space="preserve">To ensure financial viability and recover cloud operational costs, BugBountyTrack adopts a transparent two-tier SaaS pricing model for small software companies:</w:t>
+        <w:t xml:space="preserve">To ensure financial viability and recover cloud operational costs, BugBountyTrack adopts a focused commercial pricing model:</w:t>
       </w:r>
     </w:p>
     <w:tbl xmlns:w="http://schemas.openxmlformats.org/wordprocessingml/2006/main">
@@ -7823,7 +8076,7 @@
                 <w:color w:val="222222"/>
                 <w:sz w:val="18"/>
               </w:rPr>
-              <w:t xml:space="preserve">Starter Tier</w:t>
+              <w:t xml:space="preserve">Open Source / Community</w:t>
             </w:r>
           </w:p>
         </w:tc>
@@ -7849,7 +8102,7 @@
                 <w:color w:val="222222"/>
                 <w:sz w:val="18"/>
               </w:rPr>
-              <w:t xml:space="preserve">$49 / mo</w:t>
+              <w:t xml:space="preserve">$0 / mo</w:t>
             </w:r>
           </w:p>
         </w:tc>
@@ -7874,7 +8127,7 @@
                 <w:color w:val="222222"/>
                 <w:sz w:val="18"/>
               </w:rPr>
-              <w:t xml:space="preserve">Seed startups &amp; small engineering teams (5–15 devs) needing structured intake</w:t>
+              <w:t xml:space="preserve">Open-source libraries, solo maintainers &amp; non-profits</w:t>
             </w:r>
           </w:p>
         </w:tc>
@@ -7899,7 +8152,7 @@
                 <w:color w:val="222222"/>
                 <w:sz w:val="18"/>
               </w:rPr>
-              <w:t xml:space="preserve">1 active disclosure program, 3 defender seats (all with independent program-scoped decryption capability), 10 GB encrypted storage, browser OpenPGP crypto, RFC 9116 generator, GitHub commit verification, minimal-metadata email alerts, basic Redacted PDF/JSON Closure Evidence exports.</w:t>
+              <w:t xml:space="preserve">1 active public program, 1 defender seat, 5 active reports/month, 2 GB encrypted storage, signed RFC 9116 generator, GitHub commit verification.</w:t>
             </w:r>
           </w:p>
         </w:tc>
@@ -7928,7 +8181,7 @@
                 <w:color w:val="222222"/>
                 <w:sz w:val="18"/>
               </w:rPr>
-              <w:t xml:space="preserve">Team / Pro Tier</w:t>
+              <w:t xml:space="preserve">Team Launch Plan</w:t>
             </w:r>
           </w:p>
         </w:tc>
@@ -7955,7 +8208,7 @@
                 <w:color w:val="222222"/>
                 <w:sz w:val="18"/>
               </w:rPr>
-              <w:t xml:space="preserve">$149 / mo</w:t>
+              <w:t xml:space="preserve">$49 / mo</w:t>
             </w:r>
           </w:p>
         </w:tc>
@@ -7981,7 +8234,7 @@
                 <w:color w:val="222222"/>
                 <w:sz w:val="18"/>
               </w:rPr>
-              <w:t xml:space="preserve">Growing SaaS companies (15–50 devs) handling multi-product disclosure</w:t>
+              <w:t xml:space="preserve">Small software engineering teams (5–25 devs) needing structured intake</w:t>
             </w:r>
           </w:p>
         </w:tc>
@@ -8007,7 +8260,7 @@
                 <w:color w:val="222222"/>
                 <w:sz w:val="18"/>
               </w:rPr>
-              <w:t xml:space="preserve">Up to 5 programs (public &amp; private), 10 defender seats, 50 GB encrypted storage, GitHub App integration, SLA timers &amp; automated reminders, custom-branded closure exports, executive compliance summaries, priority support.</w:t>
+              <w:t xml:space="preserve">1 active disclosure program (public or invite-only), up to 5 defender seats (with program-scoped decryption), 10 GB encrypted storage, direct presigned R2 uploads, SLA countdown timers, Slack-compatible webhooks, GitHub commit &amp; branch compare verification, Redacted PDF/JSON Closure Evidence exports.</w:t>
             </w:r>
           </w:p>
         </w:tc>
@@ -8031,7 +8284,7 @@
           <w:color w:val="222222"/>
           <w:sz w:val="20"/>
         </w:rPr>
-        <w:t xml:space="preserve">With 2 paying customers on the Starter Tier (94.56 net after Stripe 2.9% + 0.30 processing fees), the platform covers 100% of its base commercial cloud operating expenses ($61.00/mo). All pricing figures represent initial validation hypotheses subject to empirical testing during the commercial pilot.</w:t>
+        <w:t xml:space="preserve">With 2 paying customers on the Team Plan (91.10 net after Lemon Squeezy 5% + 0.50 processing fees), the platform covers 100% of its base commercial cloud operating expenses ($61.00/mo). All pricing figures represent initial validation hypotheses subject to empirical testing during the commercial pilot.</w:t>
       </w:r>
     </w:p>
     <w:p xmlns:w="http://schemas.openxmlformats.org/wordprocessingml/2006/main">

</xml_diff>

<commit_message>
fix(spec): resolve critical audit findings, synchronize canonical diagrams, enforce task honesty, and expand linter to 101 checks
</commit_message>
<xml_diff>
--- a/Resources/BRD.docx
+++ b/Resources/BRD.docx
@@ -922,7 +922,7 @@
           <w:color w:val="222222"/>
           <w:sz w:val="20"/>
         </w:rPr>
-        <w:t xml:space="preserve">Commercial Subscription Realities</w:t>
+        <w:t xml:space="preserve">Triage Architecture &amp; Commercial Trade-Offs</w:t>
       </w:r>
       <w:r>
         <w:rPr>
@@ -930,7 +930,7 @@
           <w:color w:val="222222"/>
           <w:sz w:val="20"/>
         </w:rPr>
-        <w:t xml:space="preserve">: While established vendors offer entry tiers (such as HackerOne Essential VDP), existing solutions either steer organizations toward high-cost enterprise managed-triage contracts (15,000–30,000+/year) or route unencrypted vulnerability reproduction steps and exploit payloads into standard web queues and unencrypted corporate email inboxes.</w:t>
+        <w:t xml:space="preserve">: While established platforms offer entry tiers (such as HackerOne's free Essential VDP), existing solutions typically operate on a server-managed triage model where exploit details are held unencrypted on vendor infrastructure and forwarded to external mailboxes or ticketing systems. Organizations desiring confidential triage are steered toward enterprise managed-service contracts (15,000–30,000+/year) where vendor staff review raw reports. Small teams who want confidential intake without delegating report access to third-party services currently lack a lightweight, privacy-preserving tool.</w:t>
       </w:r>
     </w:p>
     <w:p xmlns:w="http://schemas.openxmlformats.org/wordprocessingml/2006/main">
@@ -6795,10 +6795,10 @@
         </w:tblBorders>
       </w:tblPr>
       <w:tblGrid>
-        <w:gridCol w:w="2117"/>
+        <w:gridCol w:w="1827"/>
         <w:gridCol w:w="1200"/>
-        <w:gridCol w:w="1520"/>
-        <w:gridCol w:w="4126"/>
+        <w:gridCol w:w="1312"/>
+        <w:gridCol w:w="4921"/>
         <w:gridCol w:w="1200"/>
       </w:tblGrid>
       <w:tr>
@@ -6807,7 +6807,7 @@
         </w:trPr>
         <w:tc>
           <w:tcPr>
-            <w:tcW w:w="2117" w:type="dxa"/>
+            <w:tcW w:w="1827" w:type="dxa"/>
             <w:shd w:val="clear" w:fill="E3EFCB"/>
             <w:tcMar>
               <w:top w:w="80" w:type="dxa"/>
@@ -6861,7 +6861,7 @@
         </w:tc>
         <w:tc>
           <w:tcPr>
-            <w:tcW w:w="1520" w:type="dxa"/>
+            <w:tcW w:w="1312" w:type="dxa"/>
             <w:shd w:val="clear" w:fill="E3EFCB"/>
             <w:tcMar>
               <w:top w:w="80" w:type="dxa"/>
@@ -6888,7 +6888,7 @@
         </w:tc>
         <w:tc>
           <w:tcPr>
-            <w:tcW w:w="4126" w:type="dxa"/>
+            <w:tcW w:w="4921" w:type="dxa"/>
             <w:shd w:val="clear" w:fill="E3EFCB"/>
             <w:tcMar>
               <w:top w:w="80" w:type="dxa"/>
@@ -6944,7 +6944,7 @@
       <w:tr>
         <w:tc>
           <w:tcPr>
-            <w:tcW w:w="2117" w:type="dxa"/>
+            <w:tcW w:w="1827" w:type="dxa"/>
             <w:tcMar>
               <w:top w:w="60" w:type="dxa"/>
               <w:bottom w:w="60" w:type="dxa"/>
@@ -6995,7 +6995,7 @@
         </w:tc>
         <w:tc>
           <w:tcPr>
-            <w:tcW w:w="1520" w:type="dxa"/>
+            <w:tcW w:w="1312" w:type="dxa"/>
             <w:tcMar>
               <w:top w:w="60" w:type="dxa"/>
               <w:bottom w:w="60" w:type="dxa"/>
@@ -7020,7 +7020,7 @@
         </w:tc>
         <w:tc>
           <w:tcPr>
-            <w:tcW w:w="4126" w:type="dxa"/>
+            <w:tcW w:w="4921" w:type="dxa"/>
             <w:tcMar>
               <w:top w:w="60" w:type="dxa"/>
               <w:bottom w:w="60" w:type="dxa"/>
@@ -7073,7 +7073,7 @@
       <w:tr>
         <w:tc>
           <w:tcPr>
-            <w:tcW w:w="2117" w:type="dxa"/>
+            <w:tcW w:w="1827" w:type="dxa"/>
             <w:shd w:val="clear" w:fill="F9FBF6"/>
             <w:tcMar>
               <w:top w:w="60" w:type="dxa"/>
@@ -7126,7 +7126,7 @@
         </w:tc>
         <w:tc>
           <w:tcPr>
-            <w:tcW w:w="1520" w:type="dxa"/>
+            <w:tcW w:w="1312" w:type="dxa"/>
             <w:shd w:val="clear" w:fill="F9FBF6"/>
             <w:tcMar>
               <w:top w:w="60" w:type="dxa"/>
@@ -7146,13 +7146,13 @@
                 <w:color w:val="222222"/>
                 <w:sz w:val="18"/>
               </w:rPr>
-              <w:t xml:space="preserve">Launch Tier Baseline</w:t>
+              <w:t xml:space="preserve">Launch Tier (Usage-Based)</w:t>
             </w:r>
           </w:p>
         </w:tc>
         <w:tc>
           <w:tcPr>
-            <w:tcW w:w="4126" w:type="dxa"/>
+            <w:tcW w:w="4921" w:type="dxa"/>
             <w:shd w:val="clear" w:fill="F9FBF6"/>
             <w:tcMar>
               <w:top w:w="60" w:type="dxa"/>
@@ -7172,7 +7172,7 @@
                 <w:color w:val="222222"/>
                 <w:sz w:val="18"/>
               </w:rPr>
-              <w:t xml:space="preserve">PostgreSQL 16 (10 GB storage, PITR branching, autoscaling compute)</w:t>
+              <w:t xml:space="preserve">PostgreSQL 16 (~180 CU-hrs compute reserve + 10 GB storage at $0.106/CU-hr)</w:t>
             </w:r>
           </w:p>
         </w:tc>
@@ -7199,7 +7199,7 @@
                 <w:color w:val="222222"/>
                 <w:sz w:val="18"/>
               </w:rPr>
-              <w:t xml:space="preserve">$19.00</w:t>
+              <w:t xml:space="preserve">~$19.00</w:t>
             </w:r>
           </w:p>
         </w:tc>
@@ -7207,7 +7207,7 @@
       <w:tr>
         <w:tc>
           <w:tcPr>
-            <w:tcW w:w="2117" w:type="dxa"/>
+            <w:tcW w:w="1827" w:type="dxa"/>
             <w:tcMar>
               <w:top w:w="60" w:type="dxa"/>
               <w:bottom w:w="60" w:type="dxa"/>
@@ -7258,7 +7258,7 @@
         </w:tc>
         <w:tc>
           <w:tcPr>
-            <w:tcW w:w="1520" w:type="dxa"/>
+            <w:tcW w:w="1312" w:type="dxa"/>
             <w:tcMar>
               <w:top w:w="60" w:type="dxa"/>
               <w:bottom w:w="60" w:type="dxa"/>
@@ -7283,7 +7283,7 @@
         </w:tc>
         <w:tc>
           <w:tcPr>
-            <w:tcW w:w="4126" w:type="dxa"/>
+            <w:tcW w:w="4921" w:type="dxa"/>
             <w:tcMar>
               <w:top w:w="60" w:type="dxa"/>
               <w:bottom w:w="60" w:type="dxa"/>
@@ -7336,7 +7336,7 @@
       <w:tr>
         <w:tc>
           <w:tcPr>
-            <w:tcW w:w="2117" w:type="dxa"/>
+            <w:tcW w:w="1827" w:type="dxa"/>
             <w:shd w:val="clear" w:fill="F9FBF6"/>
             <w:tcMar>
               <w:top w:w="60" w:type="dxa"/>
@@ -7389,7 +7389,7 @@
         </w:tc>
         <w:tc>
           <w:tcPr>
-            <w:tcW w:w="1520" w:type="dxa"/>
+            <w:tcW w:w="1312" w:type="dxa"/>
             <w:shd w:val="clear" w:fill="F9FBF6"/>
             <w:tcMar>
               <w:top w:w="60" w:type="dxa"/>
@@ -7415,7 +7415,7 @@
         </w:tc>
         <w:tc>
           <w:tcPr>
-            <w:tcW w:w="4126" w:type="dxa"/>
+            <w:tcW w:w="4921" w:type="dxa"/>
             <w:shd w:val="clear" w:fill="F9FBF6"/>
             <w:tcMar>
               <w:top w:w="60" w:type="dxa"/>
@@ -7470,7 +7470,7 @@
       <w:tr>
         <w:tc>
           <w:tcPr>
-            <w:tcW w:w="2117" w:type="dxa"/>
+            <w:tcW w:w="1827" w:type="dxa"/>
             <w:tcMar>
               <w:top w:w="60" w:type="dxa"/>
               <w:bottom w:w="60" w:type="dxa"/>
@@ -7521,7 +7521,7 @@
         </w:tc>
         <w:tc>
           <w:tcPr>
-            <w:tcW w:w="1520" w:type="dxa"/>
+            <w:tcW w:w="1312" w:type="dxa"/>
             <w:tcMar>
               <w:top w:w="60" w:type="dxa"/>
               <w:bottom w:w="60" w:type="dxa"/>
@@ -7570,7 +7570,7 @@
         </w:tc>
         <w:tc>
           <w:tcPr>
-            <w:tcW w:w="4126" w:type="dxa"/>
+            <w:tcW w:w="4921" w:type="dxa"/>
             <w:tcMar>
               <w:top w:w="60" w:type="dxa"/>
               <w:bottom w:w="60" w:type="dxa"/>
@@ -7623,7 +7623,7 @@
       <w:tr>
         <w:tc>
           <w:tcPr>
-            <w:tcW w:w="2117" w:type="dxa"/>
+            <w:tcW w:w="1827" w:type="dxa"/>
             <w:shd w:val="clear" w:fill="F9FBF6"/>
             <w:tcMar>
               <w:top w:w="60" w:type="dxa"/>
@@ -7676,7 +7676,7 @@
         </w:tc>
         <w:tc>
           <w:tcPr>
-            <w:tcW w:w="1520" w:type="dxa"/>
+            <w:tcW w:w="1312" w:type="dxa"/>
             <w:shd w:val="clear" w:fill="F9FBF6"/>
             <w:tcMar>
               <w:top w:w="60" w:type="dxa"/>
@@ -7702,7 +7702,7 @@
         </w:tc>
         <w:tc>
           <w:tcPr>
-            <w:tcW w:w="4126" w:type="dxa"/>
+            <w:tcW w:w="4921" w:type="dxa"/>
             <w:shd w:val="clear" w:fill="F9FBF6"/>
             <w:tcMar>
               <w:top w:w="60" w:type="dxa"/>
@@ -7722,7 +7722,7 @@
                 <w:color w:val="222222"/>
                 <w:sz w:val="18"/>
               </w:rPr>
-              <w:t xml:space="preserve">Handles global VAT, sales tax, direct bank payouts to Pakistan (5% + 50¢/tx)</w:t>
+              <w:t xml:space="preserve">Handles global VAT, sales tax, direct bank payouts to Pakistan (5% base + 50¢/tx + 0.5% subscription fee)</w:t>
             </w:r>
           </w:p>
         </w:tc>
@@ -7757,7 +7757,7 @@
       <w:tr>
         <w:tc>
           <w:tcPr>
-            <w:tcW w:w="2117" w:type="dxa"/>
+            <w:tcW w:w="1827" w:type="dxa"/>
             <w:tcMar>
               <w:top w:w="60" w:type="dxa"/>
               <w:bottom w:w="60" w:type="dxa"/>
@@ -7808,7 +7808,7 @@
         </w:tc>
         <w:tc>
           <w:tcPr>
-            <w:tcW w:w="1520" w:type="dxa"/>
+            <w:tcW w:w="1312" w:type="dxa"/>
             <w:tcMar>
               <w:top w:w="60" w:type="dxa"/>
               <w:bottom w:w="60" w:type="dxa"/>
@@ -7833,7 +7833,7 @@
         </w:tc>
         <w:tc>
           <w:tcPr>
-            <w:tcW w:w="4126" w:type="dxa"/>
+            <w:tcW w:w="4921" w:type="dxa"/>
             <w:tcMar>
               <w:top w:w="60" w:type="dxa"/>
               <w:bottom w:w="60" w:type="dxa"/>
@@ -8284,7 +8284,7 @@
           <w:color w:val="222222"/>
           <w:sz w:val="20"/>
         </w:rPr>
-        <w:t xml:space="preserve">With 2 paying customers on the Team Plan (91.10 net after Lemon Squeezy 5% + 0.50 processing fees), the platform covers 100% of its base commercial cloud operating expenses ($61.00/mo). All pricing figures represent initial validation hypotheses subject to empirical testing during the commercial pilot.</w:t>
+        <w:t xml:space="preserve">With 2 paying customers on the Team Plan (49/mo each = 98.00/mo gross), net revenue after Lemon Squeezy processing fees (5% base + 0.50/tx + 0.5% subscription fee = 6.39; net revenue = 91.61, or ~89.70 if international/bank transfer surcharges apply), the platform covers 100% of its base commercial cloud operating expenses (~$61.00/mo). All pricing figures represent initial validation hypotheses subject to empirical testing during the commercial pilot.</w:t>
       </w:r>
     </w:p>
     <w:p xmlns:w="http://schemas.openxmlformats.org/wordprocessingml/2006/main">

</xml_diff>

<commit_message>
fix(spec): standardize RFC 9580 v6 keys, guest recovery bundle, program-defender rules, and section SET-B
</commit_message>
<xml_diff>
--- a/Resources/BRD.docx
+++ b/Resources/BRD.docx
@@ -559,7 +559,7 @@
                 <w:color w:val="222222"/>
                 <w:sz w:val="18"/>
               </w:rPr>
-              <w:t xml:space="preserve">Session 2024–2028 / Batch 24-SET-Fall / Section SET-A</w:t>
+              <w:t xml:space="preserve">Session 2024–2028 / Batch 24-SET-Fall / Section SET-B</w:t>
             </w:r>
           </w:p>
         </w:tc>
@@ -922,15 +922,15 @@
           <w:color w:val="222222"/>
           <w:sz w:val="20"/>
         </w:rPr>
-        <w:t xml:space="preserve">Triage Architecture &amp; Commercial Trade-Offs</w:t>
-      </w:r>
-      <w:r>
-        <w:rPr>
-          <w:rFonts w:ascii="Lexend" w:hAnsi="Lexend"/>
-          <w:color w:val="222222"/>
-          <w:sz w:val="20"/>
-        </w:rPr>
-        <w:t xml:space="preserve">: While established platforms offer entry tiers (such as HackerOne's free Essential VDP), existing solutions typically operate on a server-managed triage model where exploit details are held unencrypted on vendor infrastructure and forwarded to external mailboxes or ticketing systems. Organizations desiring confidential triage are steered toward enterprise managed-service contracts (15,000–30,000+/year) where vendor staff review raw reports. Small teams who want confidential intake without delegating report access to third-party services currently lack a lightweight, privacy-preserving tool.</w:t>
+        <w:t xml:space="preserve">Triage Architecture &amp; Privacy Trade-Offs</w:t>
+      </w:r>
+      <w:r>
+        <w:rPr>
+          <w:rFonts w:ascii="Lexend" w:hAnsi="Lexend"/>
+          <w:color w:val="222222"/>
+          <w:sz w:val="20"/>
+        </w:rPr>
+        <w:t xml:space="preserve">: While established platforms offer entry tiers (such as HackerOne's free Essential VDP), existing solutions typically operate on a server-managed triage model where exploit details are held on vendor infrastructure and are accessible in plaintext to platform operators, cloud intermediaries, and support databases. Small teams who want confidential intake without delegating report access to third-party services currently lack a lightweight, privacy-preserving tool with true client-side zero-knowledge encryption.</w:t>
       </w:r>
     </w:p>
     <w:p xmlns:w="http://schemas.openxmlformats.org/wordprocessingml/2006/main">
@@ -1290,6 +1290,22 @@
           <w:sz w:val="20"/>
         </w:rPr>
         <w:t xml:space="preserve">CLOSED_UNVERIFIED_TIMEOUT</w:t>
+      </w:r>
+      <w:r>
+        <w:rPr>
+          <w:rFonts w:ascii="Lexend" w:hAnsi="Lexend"/>
+          <w:color w:val="222222"/>
+          <w:sz w:val="20"/>
+        </w:rPr>
+        <w:t xml:space="preserve">, </w:t>
+      </w:r>
+      <w:r>
+        <w:rPr>
+          <w:rFonts w:ascii="Consolas" w:hAnsi="Consolas"/>
+          <w:color w:val="9C4146"/>
+          <w:sz w:val="20"/>
+        </w:rPr>
+        <w:t xml:space="preserve">CLOSED_INCOMPLETE</w:t>
       </w:r>
       <w:r>
         <w:rPr>
@@ -1648,7 +1664,7 @@
                 <w:color w:val="222222"/>
                 <w:sz w:val="18"/>
               </w:rPr>
-              <w:t xml:space="preserve">Protect sensitive exploit data from server-side database exposure by performing asymmetric OpenPGP encryption in the browser, pinning strictly to v4 Ed25519/X25519 keys (&lt;50ms keygen) and Argon2 S2K key protection.</w:t>
+              <w:t xml:space="preserve">Protect sensitive exploit data from server-side database exposure by performing asymmetric OpenPGP encryption in the browser, pinning strictly to RFC 9580 Version 6 Ed25519/X25519 keys (targeting sub-50ms bare keygen) and Argon2id S2K key protection.</w:t>
             </w:r>
           </w:p>
         </w:tc>
@@ -2193,7 +2209,7 @@
                 <w:color w:val="222222"/>
                 <w:sz w:val="18"/>
               </w:rPr>
-              <w:t xml:space="preserve">Every closed report shall have a recorded closure category and justification. Only successfully retested reports shall be labeled verified. Rejected, duplicate, risk-accepted, and timeout outcomes shall be reported separately.</w:t>
+              <w:t xml:space="preserve">Every closed report shall have a recorded closure category and justification. Only successfully retested reports shall be labeled verified. Rejected, duplicate, risk-accepted, incomplete, and timeout outcomes shall be reported separately.</w:t>
             </w:r>
           </w:p>
         </w:tc>
@@ -3442,7 +3458,7 @@
           <w:color w:val="222222"/>
           <w:sz w:val="20"/>
         </w:rPr>
-        <w:t xml:space="preserve">: external researchers can submit vulnerability reports without registering an account. The client browser generates an ephemeral Curve25519 keypair, encrypts the report to the program defenders and organization recovery key, and provides the submitter with an opaque secret tracking URL (</w:t>
+        <w:t xml:space="preserve">: external researchers can submit vulnerability reports without registering an account. The client browser generates an ephemeral RFC 9580 v6 Curve25519 keypair, encrypts the report to the program defenders and organization recovery key, and provides the submitter with an opaque secret tracking URL protected by a client-side URI fragment (</w:t>
       </w:r>
       <w:r>
         <w:rPr>
@@ -3450,15 +3466,31 @@
           <w:color w:val="9C4146"/>
           <w:sz w:val="20"/>
         </w:rPr>
-        <w:t xml:space="preserve">/report/track/BBT-RPT-XXXX?token=&lt;secret&gt;</w:t>
-      </w:r>
-      <w:r>
-        <w:rPr>
-          <w:rFonts w:ascii="Lexend" w:hAnsi="Lexend"/>
-          <w:color w:val="222222"/>
-          <w:sz w:val="20"/>
-        </w:rPr>
-        <w:t xml:space="preserve">) to review replies and submit retests.</w:t>
+        <w:t xml:space="preserve">/report/track/BBT-RPT-XXXX#token=&lt;secret&gt;</w:t>
+      </w:r>
+      <w:r>
+        <w:rPr>
+          <w:rFonts w:ascii="Lexend" w:hAnsi="Lexend"/>
+          <w:color w:val="222222"/>
+          <w:sz w:val="20"/>
+        </w:rPr>
+        <w:t xml:space="preserve">) and a downloadable versioned </w:t>
+      </w:r>
+      <w:r>
+        <w:rPr>
+          <w:rFonts w:ascii="Consolas" w:hAnsi="Consolas"/>
+          <w:color w:val="9C4146"/>
+          <w:sz w:val="20"/>
+        </w:rPr>
+        <w:t xml:space="preserve">.bbt-recovery.json</w:t>
+      </w:r>
+      <w:r>
+        <w:rPr>
+          <w:rFonts w:ascii="Lexend" w:hAnsi="Lexend"/>
+          <w:color w:val="222222"/>
+          <w:sz w:val="20"/>
+        </w:rPr>
+        <w:t xml:space="preserve"> package to review replies and submit retests.</w:t>
       </w:r>
     </w:p>
     <w:p xmlns:w="http://schemas.openxmlformats.org/wordprocessingml/2006/main">
@@ -3978,7 +4010,7 @@
           <w:color w:val="222222"/>
           <w:sz w:val="20"/>
         </w:rPr>
-        <w:t xml:space="preserve">: Encryption shall utilize an OpenPGP multi-recipient envelope encrypting the payload to the program's authorized defenders (N ≤ 10), the organization's offline master recovery key, and the reporting researcher's key (or ephemeral report key).</w:t>
+        <w:t xml:space="preserve">: Encryption shall utilize an OpenPGP multi-recipient envelope encrypting the payload to the program's authorized defenders (up to 10 authorized defenders), the organization's offline master recovery key, and the reporting researcher's key (or ephemeral report key).</w:t>
       </w:r>
     </w:p>
     <w:p xmlns:w="http://schemas.openxmlformats.org/wordprocessingml/2006/main">
@@ -4040,7 +4072,23 @@
           <w:color w:val="222222"/>
           <w:sz w:val="20"/>
         </w:rPr>
-        <w:t xml:space="preserve">: Private keys shall remain strictly within client-side storage, protected by local encryption passphrases derived via OpenPGP native Argon2 S2K. All keys are standardized on v4 Ed25519/X25519 Curve25519 algorithms (&lt;50ms generation). RSA-4096 is deprecated and dropped to eliminate keygen stalls.</w:t>
+        <w:t xml:space="preserve">: Private keys shall remain strictly within client-side storage, protected by local encryption passphrases derived via OpenPGP native Argon2id S2K (</w:t>
+      </w:r>
+      <w:r>
+        <w:rPr>
+          <w:rFonts w:ascii="Consolas" w:hAnsi="Consolas"/>
+          <w:color w:val="9C4146"/>
+          <w:sz w:val="20"/>
+        </w:rPr>
+        <w:t xml:space="preserve">t=3, m=65536, p=4</w:t>
+      </w:r>
+      <w:r>
+        <w:rPr>
+          <w:rFonts w:ascii="Lexend" w:hAnsi="Lexend"/>
+          <w:color w:val="222222"/>
+          <w:sz w:val="20"/>
+        </w:rPr>
+        <w:t xml:space="preserve">). All keys are standardized on RFC 9580 Version 6 Ed25519/X25519 Curve25519 algorithms (targeting sub-50ms bare key generation) with 64-character SHA-256 fingerprints. RSA-4096 and OpenPGP v4 keys are deprecated and excluded to eliminate keygen stalls and adhere to modern standards.</w:t>
       </w:r>
     </w:p>
     <w:p xmlns:w="http://schemas.openxmlformats.org/wordprocessingml/2006/main">
@@ -4851,7 +4899,7 @@
           <w:color w:val="222222"/>
           <w:sz w:val="20"/>
         </w:rPr>
-        <w:t xml:space="preserve">: Reports shall transition from </w:t>
+        <w:t xml:space="preserve">: Reports in </w:t>
       </w:r>
       <w:r>
         <w:rPr>
@@ -4867,7 +4915,7 @@
           <w:color w:val="222222"/>
           <w:sz w:val="20"/>
         </w:rPr>
-        <w:t xml:space="preserve"> to final closure exclusively under one of three distinct terminal states:</w:t>
+        <w:t xml:space="preserve"> shall transition to final closure exclusively under one of three distinct terminal states:</w:t>
       </w:r>
     </w:p>
     <w:p xmlns:w="http://schemas.openxmlformats.org/wordprocessingml/2006/main">
@@ -4966,15 +5014,15 @@
           <w:color w:val="222222"/>
           <w:sz w:val="20"/>
         </w:rPr>
-        <w:t xml:space="preserve">only through an explicit authorized reviewer action with recorded justification</w:t>
-      </w:r>
-      <w:r>
-        <w:rPr>
-          <w:rFonts w:ascii="Lexend" w:hAnsi="Lexend"/>
-          <w:color w:val="222222"/>
-          <w:sz w:val="20"/>
-        </w:rPr>
-        <w:t xml:space="preserve">.</w:t>
+        <w:t xml:space="preserve">only through an explicit authorized reviewer action with recorded administrative justification</w:t>
+      </w:r>
+      <w:r>
+        <w:rPr>
+          <w:rFonts w:ascii="Lexend" w:hAnsi="Lexend"/>
+          <w:color w:val="222222"/>
+          <w:sz w:val="20"/>
+        </w:rPr>
+        <w:t xml:space="preserve">. Never counted as a verified fix.</w:t>
       </w:r>
     </w:p>
     <w:p xmlns:w="http://schemas.openxmlformats.org/wordprocessingml/2006/main">
@@ -4997,31 +5045,15 @@
           <w:color w:val="222222"/>
           <w:sz w:val="20"/>
         </w:rPr>
-        <w:t xml:space="preserve">BR-7.2</w:t>
-      </w:r>
-      <w:r>
-        <w:rPr>
-          <w:rFonts w:ascii="Lexend" w:hAnsi="Lexend"/>
-          <w:color w:val="222222"/>
-          <w:sz w:val="20"/>
-        </w:rPr>
-        <w:t xml:space="preserve">: From </w:t>
-      </w:r>
-      <w:r>
-        <w:rPr>
-          <w:rFonts w:ascii="Consolas" w:hAnsi="Consolas"/>
-          <w:color w:val="9C4146"/>
-          <w:sz w:val="20"/>
-        </w:rPr>
-        <w:t xml:space="preserve">RETEST_PENDING</w:t>
-      </w:r>
-      <w:r>
-        <w:rPr>
-          <w:rFonts w:ascii="Lexend" w:hAnsi="Lexend"/>
-          <w:color w:val="222222"/>
-          <w:sz w:val="20"/>
-        </w:rPr>
-        <w:t xml:space="preserve">, reports shall transition to final closure exclusively under one of three distinct terminal states:</w:t>
+        <w:t xml:space="preserve">BR-7.4</w:t>
+      </w:r>
+      <w:r>
+        <w:rPr>
+          <w:rFonts w:ascii="Lexend" w:hAnsi="Lexend"/>
+          <w:color w:val="222222"/>
+          <w:sz w:val="20"/>
+        </w:rPr>
+        <w:t xml:space="preserve">: Additional terminal states shall include:</w:t>
       </w:r>
     </w:p>
     <w:p xmlns:w="http://schemas.openxmlformats.org/wordprocessingml/2006/main">
@@ -5043,15 +5075,47 @@
           <w:color w:val="9C4146"/>
           <w:sz w:val="20"/>
         </w:rPr>
-        <w:t xml:space="preserve">VERIFIED_RESEARCHER</w:t>
-      </w:r>
-      <w:r>
-        <w:rPr>
-          <w:rFonts w:ascii="Lexend" w:hAnsi="Lexend"/>
-          <w:color w:val="222222"/>
-          <w:sz w:val="20"/>
-        </w:rPr>
-        <w:t xml:space="preserve">: The reporting researcher independently confirmed the vulnerability is mitigated on the target deployment.</w:t>
+        <w:t xml:space="preserve">CLOSED_INCOMPLETE</w:t>
+      </w:r>
+      <w:r>
+        <w:rPr>
+          <w:rFonts w:ascii="Lexend" w:hAnsi="Lexend"/>
+          <w:color w:val="222222"/>
+          <w:sz w:val="20"/>
+        </w:rPr>
+        <w:t xml:space="preserve">: Clarification inquiry (</w:t>
+      </w:r>
+      <w:r>
+        <w:rPr>
+          <w:rFonts w:ascii="Consolas" w:hAnsi="Consolas"/>
+          <w:color w:val="9C4146"/>
+          <w:sz w:val="20"/>
+        </w:rPr>
+        <w:t xml:space="preserve">NEED_MORE_INFO</w:t>
+      </w:r>
+      <w:r>
+        <w:rPr>
+          <w:rFonts w:ascii="Lexend" w:hAnsi="Lexend"/>
+          <w:color w:val="222222"/>
+          <w:sz w:val="20"/>
+        </w:rPr>
+        <w:t xml:space="preserve">) expired after 14 days of researcher inactivity at intake. Distinct from </w:t>
+      </w:r>
+      <w:r>
+        <w:rPr>
+          <w:rFonts w:ascii="Consolas" w:hAnsi="Consolas"/>
+          <w:color w:val="9C4146"/>
+          <w:sz w:val="20"/>
+        </w:rPr>
+        <w:t xml:space="preserve">CLOSED_UNVERIFIED_TIMEOUT</w:t>
+      </w:r>
+      <w:r>
+        <w:rPr>
+          <w:rFonts w:ascii="Lexend" w:hAnsi="Lexend"/>
+          <w:color w:val="222222"/>
+          <w:sz w:val="20"/>
+        </w:rPr>
+        <w:t xml:space="preserve"> (which applies only to deployed fixes awaiting retest).</w:t>
       </w:r>
     </w:p>
     <w:p xmlns:w="http://schemas.openxmlformats.org/wordprocessingml/2006/main">
@@ -5073,15 +5137,47 @@
           <w:color w:val="9C4146"/>
           <w:sz w:val="20"/>
         </w:rPr>
-        <w:t xml:space="preserve">VERIFIED_INTERNAL</w:t>
-      </w:r>
-      <w:r>
-        <w:rPr>
-          <w:rFonts w:ascii="Lexend" w:hAnsi="Lexend"/>
-          <w:color w:val="222222"/>
-          <w:sz w:val="20"/>
-        </w:rPr>
-        <w:t xml:space="preserve">: An authorized organization reviewer certified the fix, recording whether they authored the fix.</w:t>
+        <w:t xml:space="preserve">RISK_ACCEPTED</w:t>
+      </w:r>
+      <w:r>
+        <w:rPr>
+          <w:rFonts w:ascii="Lexend" w:hAnsi="Lexend"/>
+          <w:color w:val="222222"/>
+          <w:sz w:val="20"/>
+        </w:rPr>
+        <w:t xml:space="preserve">: Formal organization acceptance of operational risk without code modification. Requires an authorized decision-maker (</w:t>
+      </w:r>
+      <w:r>
+        <w:rPr>
+          <w:rFonts w:ascii="Consolas" w:hAnsi="Consolas"/>
+          <w:color w:val="9C4146"/>
+          <w:sz w:val="20"/>
+        </w:rPr>
+        <w:t xml:space="preserve">ORG_OWNER</w:t>
+      </w:r>
+      <w:r>
+        <w:rPr>
+          <w:rFonts w:ascii="Lexend" w:hAnsi="Lexend"/>
+          <w:color w:val="222222"/>
+          <w:sz w:val="20"/>
+        </w:rPr>
+        <w:t xml:space="preserve"> or Lead Defender), a mandatory written business and security rationale, and a scheduled review date. Under no circumstances does </w:t>
+      </w:r>
+      <w:r>
+        <w:rPr>
+          <w:rFonts w:ascii="Consolas" w:hAnsi="Consolas"/>
+          <w:color w:val="9C4146"/>
+          <w:sz w:val="20"/>
+        </w:rPr>
+        <w:t xml:space="preserve">RISK_ACCEPTED</w:t>
+      </w:r>
+      <w:r>
+        <w:rPr>
+          <w:rFonts w:ascii="Lexend" w:hAnsi="Lexend"/>
+          <w:color w:val="222222"/>
+          <w:sz w:val="20"/>
+        </w:rPr>
+        <w:t xml:space="preserve"> count as a passed retest or verified remediation.</w:t>
       </w:r>
     </w:p>
     <w:p xmlns:w="http://schemas.openxmlformats.org/wordprocessingml/2006/main">
@@ -5103,32 +5199,63 @@
           <w:color w:val="9C4146"/>
           <w:sz w:val="20"/>
         </w:rPr>
-        <w:t xml:space="preserve">CLOSED_UNVERIFIED_TIMEOUT</w:t>
-      </w:r>
-      <w:r>
-        <w:rPr>
-          <w:rFonts w:ascii="Lexend" w:hAnsi="Lexend"/>
-          <w:color w:val="222222"/>
-          <w:sz w:val="20"/>
-        </w:rPr>
-        <w:t xml:space="preserve">: Closed following an expired researcher grace period (≥ 14 days) </w:t>
-      </w:r>
-      <w:r>
-        <w:rPr>
-          <w:rFonts w:ascii="Lexend" w:hAnsi="Lexend"/>
-          <w:b/>
-          <w:color w:val="222222"/>
-          <w:sz w:val="20"/>
-        </w:rPr>
-        <w:t xml:space="preserve">only through an explicit authorized reviewer action with recorded administrative justification</w:t>
-      </w:r>
-      <w:r>
-        <w:rPr>
-          <w:rFonts w:ascii="Lexend" w:hAnsi="Lexend"/>
-          <w:color w:val="222222"/>
-          <w:sz w:val="20"/>
-        </w:rPr>
-        <w:t xml:space="preserve">. Never counted as a verified fix.</w:t>
+        <w:t xml:space="preserve">REJECTED_SPAM</w:t>
+      </w:r>
+      <w:r>
+        <w:rPr>
+          <w:rFonts w:ascii="Lexend" w:hAnsi="Lexend"/>
+          <w:color w:val="222222"/>
+          <w:sz w:val="20"/>
+        </w:rPr>
+        <w:t xml:space="preserve">, </w:t>
+      </w:r>
+      <w:r>
+        <w:rPr>
+          <w:rFonts w:ascii="Consolas" w:hAnsi="Consolas"/>
+          <w:color w:val="9C4146"/>
+          <w:sz w:val="20"/>
+        </w:rPr>
+        <w:t xml:space="preserve">REJECTED_INVALID</w:t>
+      </w:r>
+      <w:r>
+        <w:rPr>
+          <w:rFonts w:ascii="Lexend" w:hAnsi="Lexend"/>
+          <w:color w:val="222222"/>
+          <w:sz w:val="20"/>
+        </w:rPr>
+        <w:t xml:space="preserve">, </w:t>
+      </w:r>
+      <w:r>
+        <w:rPr>
+          <w:rFonts w:ascii="Consolas" w:hAnsi="Consolas"/>
+          <w:color w:val="9C4146"/>
+          <w:sz w:val="20"/>
+        </w:rPr>
+        <w:t xml:space="preserve">DUPLICATE</w:t>
+      </w:r>
+      <w:r>
+        <w:rPr>
+          <w:rFonts w:ascii="Lexend" w:hAnsi="Lexend"/>
+          <w:color w:val="222222"/>
+          <w:sz w:val="20"/>
+        </w:rPr>
+        <w:t xml:space="preserve">, and </w:t>
+      </w:r>
+      <w:r>
+        <w:rPr>
+          <w:rFonts w:ascii="Consolas" w:hAnsi="Consolas"/>
+          <w:color w:val="9C4146"/>
+          <w:sz w:val="20"/>
+        </w:rPr>
+        <w:t xml:space="preserve">WITHDRAWN</w:t>
+      </w:r>
+      <w:r>
+        <w:rPr>
+          <w:rFonts w:ascii="Lexend" w:hAnsi="Lexend"/>
+          <w:color w:val="222222"/>
+          <w:sz w:val="20"/>
+        </w:rPr>
+        <w:t xml:space="preserve">.</w:t>
       </w:r>
     </w:p>
     <w:p xmlns:w="http://schemas.openxmlformats.org/wordprocessingml/2006/main">
@@ -5151,15 +5278,47 @@
           <w:color w:val="222222"/>
           <w:sz w:val="20"/>
         </w:rPr>
-        <w:t xml:space="preserve">BR-7.3</w:t>
-      </w:r>
-      <w:r>
-        <w:rPr>
-          <w:rFonts w:ascii="Lexend" w:hAnsi="Lexend"/>
-          <w:color w:val="222222"/>
-          <w:sz w:val="20"/>
-        </w:rPr>
-        <w:t xml:space="preserve">: Additional terminal states include:</w:t>
+        <w:t xml:space="preserve">BR-7.5</w:t>
+      </w:r>
+      <w:r>
+        <w:rPr>
+          <w:rFonts w:ascii="Lexend" w:hAnsi="Lexend"/>
+          <w:color w:val="222222"/>
+          <w:sz w:val="20"/>
+        </w:rPr>
+        <w:t xml:space="preserve">: Reports in </w:t>
+      </w:r>
+      <w:r>
+        <w:rPr>
+          <w:rFonts w:ascii="Consolas" w:hAnsi="Consolas"/>
+          <w:color w:val="9C4146"/>
+          <w:sz w:val="20"/>
+        </w:rPr>
+        <w:t xml:space="preserve">NEED_MORE_INFO</w:t>
+      </w:r>
+      <w:r>
+        <w:rPr>
+          <w:rFonts w:ascii="Lexend" w:hAnsi="Lexend"/>
+          <w:color w:val="222222"/>
+          <w:sz w:val="20"/>
+        </w:rPr>
+        <w:t xml:space="preserve"> shall automatically transition to </w:t>
+      </w:r>
+      <w:r>
+        <w:rPr>
+          <w:rFonts w:ascii="Consolas" w:hAnsi="Consolas"/>
+          <w:color w:val="9C4146"/>
+          <w:sz w:val="20"/>
+        </w:rPr>
+        <w:t xml:space="preserve">CLOSED_INCOMPLETE</w:t>
+      </w:r>
+      <w:r>
+        <w:rPr>
+          <w:rFonts w:ascii="Lexend" w:hAnsi="Lexend"/>
+          <w:color w:val="222222"/>
+          <w:sz w:val="20"/>
+        </w:rPr>
+        <w:t xml:space="preserve"> after 14 days of researcher inactivity without clarification, preserving the audit record. Reopening is permitted if the researcher subsequently provides the required clarification.</w:t>
       </w:r>
     </w:p>
     <w:p xmlns:w="http://schemas.openxmlformats.org/wordprocessingml/2006/main">
@@ -5177,19 +5336,36 @@
       </w:r>
       <w:r>
         <w:rPr>
+          <w:rFonts w:ascii="Lexend" w:hAnsi="Lexend"/>
+          <w:b/>
+          <w:color w:val="222222"/>
+          <w:sz w:val="20"/>
+        </w:rPr>
+        <w:t xml:space="preserve">BR-7.6</w:t>
+      </w:r>
+      <w:r>
+        <w:rPr>
+          <w:rFonts w:ascii="Lexend" w:hAnsi="Lexend"/>
+          <w:color w:val="222222"/>
+          <w:sz w:val="20"/>
+        </w:rPr>
+        <w:t xml:space="preserve">: If retesting reveals that the vulnerability persists, the state transition shall record a </w:t>
+      </w:r>
+      <w:r>
+        <w:rPr>
           <w:rFonts w:ascii="Consolas" w:hAnsi="Consolas"/>
           <w:color w:val="9C4146"/>
           <w:sz w:val="20"/>
         </w:rPr>
-        <w:t xml:space="preserve">CLOSED_INCOMPLETE</w:t>
-      </w:r>
-      <w:r>
-        <w:rPr>
-          <w:rFonts w:ascii="Lexend" w:hAnsi="Lexend"/>
-          <w:color w:val="222222"/>
-          <w:sz w:val="20"/>
-        </w:rPr>
-        <w:t xml:space="preserve">: Clarification inquiry (</w:t>
+        <w:t xml:space="preserve">RETEST_FAILED</w:t>
+      </w:r>
+      <w:r>
+        <w:rPr>
+          <w:rFonts w:ascii="Lexend" w:hAnsi="Lexend"/>
+          <w:color w:val="222222"/>
+          <w:sz w:val="20"/>
+        </w:rPr>
+        <w:t xml:space="preserve"> audit event and return to </w:t>
       </w:r>
       <w:r>
         <w:rPr>
@@ -5197,31 +5373,15 @@
           <w:color w:val="9C4146"/>
           <w:sz w:val="20"/>
         </w:rPr>
-        <w:t xml:space="preserve">NEED_MORE_INFO</w:t>
-      </w:r>
-      <w:r>
-        <w:rPr>
-          <w:rFonts w:ascii="Lexend" w:hAnsi="Lexend"/>
-          <w:color w:val="222222"/>
-          <w:sz w:val="20"/>
-        </w:rPr>
-        <w:t xml:space="preserve">) expired after 14 days of researcher inactivity at intake. Distinct from </w:t>
-      </w:r>
-      <w:r>
-        <w:rPr>
-          <w:rFonts w:ascii="Consolas" w:hAnsi="Consolas"/>
-          <w:color w:val="9C4146"/>
-          <w:sz w:val="20"/>
-        </w:rPr>
-        <w:t xml:space="preserve">CLOSED_UNVERIFIED_TIMEOUT</w:t>
-      </w:r>
-      <w:r>
-        <w:rPr>
-          <w:rFonts w:ascii="Lexend" w:hAnsi="Lexend"/>
-          <w:color w:val="222222"/>
-          <w:sz w:val="20"/>
-        </w:rPr>
-        <w:t xml:space="preserve"> (which applies only to deployed fixes awaiting retest).</w:t>
+        <w:t xml:space="preserve">ACCEPTED</w:t>
+      </w:r>
+      <w:r>
+        <w:rPr>
+          <w:rFonts w:ascii="Lexend" w:hAnsi="Lexend"/>
+          <w:color w:val="222222"/>
+          <w:sz w:val="20"/>
+        </w:rPr>
+        <w:t xml:space="preserve">, preserving the failed retest evidence in the immutable audit log.</w:t>
       </w:r>
     </w:p>
     <w:p xmlns:w="http://schemas.openxmlformats.org/wordprocessingml/2006/main">
@@ -5239,19 +5399,36 @@
       </w:r>
       <w:r>
         <w:rPr>
+          <w:rFonts w:ascii="Lexend" w:hAnsi="Lexend"/>
+          <w:b/>
+          <w:color w:val="222222"/>
+          <w:sz w:val="20"/>
+        </w:rPr>
+        <w:t xml:space="preserve">BR-7.7</w:t>
+      </w:r>
+      <w:r>
+        <w:rPr>
+          <w:rFonts w:ascii="Lexend" w:hAnsi="Lexend"/>
+          <w:color w:val="222222"/>
+          <w:sz w:val="20"/>
+        </w:rPr>
+        <w:t xml:space="preserve">: Reopening a closed report shall be restricted to remediation closures (</w:t>
+      </w:r>
+      <w:r>
+        <w:rPr>
           <w:rFonts w:ascii="Consolas" w:hAnsi="Consolas"/>
           <w:color w:val="9C4146"/>
           <w:sz w:val="20"/>
         </w:rPr>
-        <w:t xml:space="preserve">RISK_ACCEPTED</w:t>
-      </w:r>
-      <w:r>
-        <w:rPr>
-          <w:rFonts w:ascii="Lexend" w:hAnsi="Lexend"/>
-          <w:color w:val="222222"/>
-          <w:sz w:val="20"/>
-        </w:rPr>
-        <w:t xml:space="preserve">: Formal organization acceptance of operational risk without code modification. Requires an authorized decision-maker (</w:t>
+        <w:t xml:space="preserve">VERIFIED_RESEARCHER</w:t>
+      </w:r>
+      <w:r>
+        <w:rPr>
+          <w:rFonts w:ascii="Lexend" w:hAnsi="Lexend"/>
+          <w:color w:val="222222"/>
+          <w:sz w:val="20"/>
+        </w:rPr>
+        <w:t xml:space="preserve">, </w:t>
       </w:r>
       <w:r>
         <w:rPr>
@@ -5259,15 +5436,15 @@
           <w:color w:val="9C4146"/>
           <w:sz w:val="20"/>
         </w:rPr>
-        <w:t xml:space="preserve">ORG_OWNER</w:t>
-      </w:r>
-      <w:r>
-        <w:rPr>
-          <w:rFonts w:ascii="Lexend" w:hAnsi="Lexend"/>
-          <w:color w:val="222222"/>
-          <w:sz w:val="20"/>
-        </w:rPr>
-        <w:t xml:space="preserve"> or Lead Defender), a mandatory written business and security rationale, and a scheduled review date. Under no circumstances does </w:t>
+        <w:t xml:space="preserve">VERIFIED_INTERNAL</w:t>
+      </w:r>
+      <w:r>
+        <w:rPr>
+          <w:rFonts w:ascii="Lexend" w:hAnsi="Lexend"/>
+          <w:color w:val="222222"/>
+          <w:sz w:val="20"/>
+        </w:rPr>
+        <w:t xml:space="preserve">, </w:t>
       </w:r>
       <w:r>
         <w:rPr>
@@ -5275,6 +5452,38 @@
           <w:color w:val="9C4146"/>
           <w:sz w:val="20"/>
         </w:rPr>
+        <w:t xml:space="preserve">CLOSED_UNVERIFIED_TIMEOUT</w:t>
+      </w:r>
+      <w:r>
+        <w:rPr>
+          <w:rFonts w:ascii="Lexend" w:hAnsi="Lexend"/>
+          <w:color w:val="222222"/>
+          <w:sz w:val="20"/>
+        </w:rPr>
+        <w:t xml:space="preserve">), intake abandonment (</w:t>
+      </w:r>
+      <w:r>
+        <w:rPr>
+          <w:rFonts w:ascii="Consolas" w:hAnsi="Consolas"/>
+          <w:color w:val="9C4146"/>
+          <w:sz w:val="20"/>
+        </w:rPr>
+        <w:t xml:space="preserve">CLOSED_INCOMPLETE</w:t>
+      </w:r>
+      <w:r>
+        <w:rPr>
+          <w:rFonts w:ascii="Lexend" w:hAnsi="Lexend"/>
+          <w:color w:val="222222"/>
+          <w:sz w:val="20"/>
+        </w:rPr>
+        <w:t xml:space="preserve">), and disputed non-remediation outcomes (</w:t>
+      </w:r>
+      <w:r>
+        <w:rPr>
+          <w:rFonts w:ascii="Consolas" w:hAnsi="Consolas"/>
+          <w:color w:val="9C4146"/>
+          <w:sz w:val="20"/>
+        </w:rPr>
         <w:t xml:space="preserve">RISK_ACCEPTED</w:t>
       </w:r>
       <w:r>
@@ -5283,7 +5492,87 @@
           <w:color w:val="222222"/>
           <w:sz w:val="20"/>
         </w:rPr>
-        <w:t xml:space="preserve"> count as a passed retest or verified remediation.</w:t>
+        <w:t xml:space="preserve">, </w:t>
+      </w:r>
+      <w:r>
+        <w:rPr>
+          <w:rFonts w:ascii="Consolas" w:hAnsi="Consolas"/>
+          <w:color w:val="9C4146"/>
+          <w:sz w:val="20"/>
+        </w:rPr>
+        <w:t xml:space="preserve">REJECTED_INVALID</w:t>
+      </w:r>
+      <w:r>
+        <w:rPr>
+          <w:rFonts w:ascii="Lexend" w:hAnsi="Lexend"/>
+          <w:color w:val="222222"/>
+          <w:sz w:val="20"/>
+        </w:rPr>
+        <w:t xml:space="preserve">, </w:t>
+      </w:r>
+      <w:r>
+        <w:rPr>
+          <w:rFonts w:ascii="Consolas" w:hAnsi="Consolas"/>
+          <w:color w:val="9C4146"/>
+          <w:sz w:val="20"/>
+        </w:rPr>
+        <w:t xml:space="preserve">DUPLICATE</w:t>
+      </w:r>
+      <w:r>
+        <w:rPr>
+          <w:rFonts w:ascii="Lexend" w:hAnsi="Lexend"/>
+          <w:color w:val="222222"/>
+          <w:sz w:val="20"/>
+        </w:rPr>
+        <w:t xml:space="preserve">). Reopening requires an authorized Defender or Tenant Owner action recording an immutable justification log, transitioning the ticket back to </w:t>
+      </w:r>
+      <w:r>
+        <w:rPr>
+          <w:rFonts w:ascii="Consolas" w:hAnsi="Consolas"/>
+          <w:color w:val="9C4146"/>
+          <w:sz w:val="20"/>
+        </w:rPr>
+        <w:t xml:space="preserve">TRIAGING</w:t>
+      </w:r>
+      <w:r>
+        <w:rPr>
+          <w:rFonts w:ascii="Lexend" w:hAnsi="Lexend"/>
+          <w:color w:val="222222"/>
+          <w:sz w:val="20"/>
+        </w:rPr>
+        <w:t xml:space="preserve">. Scanner spam (</w:t>
+      </w:r>
+      <w:r>
+        <w:rPr>
+          <w:rFonts w:ascii="Consolas" w:hAnsi="Consolas"/>
+          <w:color w:val="9C4146"/>
+          <w:sz w:val="20"/>
+        </w:rPr>
+        <w:t xml:space="preserve">REJECTED_SPAM</w:t>
+      </w:r>
+      <w:r>
+        <w:rPr>
+          <w:rFonts w:ascii="Lexend" w:hAnsi="Lexend"/>
+          <w:color w:val="222222"/>
+          <w:sz w:val="20"/>
+        </w:rPr>
+        <w:t xml:space="preserve">) and voluntary retractions (</w:t>
+      </w:r>
+      <w:r>
+        <w:rPr>
+          <w:rFonts w:ascii="Consolas" w:hAnsi="Consolas"/>
+          <w:color w:val="9C4146"/>
+          <w:sz w:val="20"/>
+        </w:rPr>
+        <w:t xml:space="preserve">WITHDRAWN</w:t>
+      </w:r>
+      <w:r>
+        <w:rPr>
+          <w:rFonts w:ascii="Lexend" w:hAnsi="Lexend"/>
+          <w:color w:val="222222"/>
+          <w:sz w:val="20"/>
+        </w:rPr>
+        <w:t xml:space="preserve">) cannot be reopened.</w:t>
       </w:r>
     </w:p>
     <w:p xmlns:w="http://schemas.openxmlformats.org/wordprocessingml/2006/main">
@@ -5301,263 +5590,12 @@
       </w:r>
       <w:r>
         <w:rPr>
-          <w:rFonts w:ascii="Consolas" w:hAnsi="Consolas"/>
-          <w:color w:val="9C4146"/>
-          <w:sz w:val="20"/>
-        </w:rPr>
-        <w:t xml:space="preserve">REJECTED_SPAM</w:t>
-      </w:r>
-      <w:r>
-        <w:rPr>
-          <w:rFonts w:ascii="Lexend" w:hAnsi="Lexend"/>
-          <w:color w:val="222222"/>
-          <w:sz w:val="20"/>
-        </w:rPr>
-        <w:t xml:space="preserve">, </w:t>
-      </w:r>
-      <w:r>
-        <w:rPr>
-          <w:rFonts w:ascii="Consolas" w:hAnsi="Consolas"/>
-          <w:color w:val="9C4146"/>
-          <w:sz w:val="20"/>
-        </w:rPr>
-        <w:t xml:space="preserve">REJECTED_INVALID</w:t>
-      </w:r>
-      <w:r>
-        <w:rPr>
-          <w:rFonts w:ascii="Lexend" w:hAnsi="Lexend"/>
-          <w:color w:val="222222"/>
-          <w:sz w:val="20"/>
-        </w:rPr>
-        <w:t xml:space="preserve">, </w:t>
-      </w:r>
-      <w:r>
-        <w:rPr>
-          <w:rFonts w:ascii="Consolas" w:hAnsi="Consolas"/>
-          <w:color w:val="9C4146"/>
-          <w:sz w:val="20"/>
-        </w:rPr>
-        <w:t xml:space="preserve">DUPLICATE</w:t>
-      </w:r>
-      <w:r>
-        <w:rPr>
-          <w:rFonts w:ascii="Lexend" w:hAnsi="Lexend"/>
-          <w:color w:val="222222"/>
-          <w:sz w:val="20"/>
-        </w:rPr>
-        <w:t xml:space="preserve">, and </w:t>
-      </w:r>
-      <w:r>
-        <w:rPr>
-          <w:rFonts w:ascii="Consolas" w:hAnsi="Consolas"/>
-          <w:color w:val="9C4146"/>
-          <w:sz w:val="20"/>
-        </w:rPr>
-        <w:t xml:space="preserve">WITHDRAWN</w:t>
-      </w:r>
-      <w:r>
-        <w:rPr>
-          <w:rFonts w:ascii="Lexend" w:hAnsi="Lexend"/>
-          <w:color w:val="222222"/>
-          <w:sz w:val="20"/>
-        </w:rPr>
-        <w:t xml:space="preserve">.</w:t>
-      </w:r>
-    </w:p>
-    <w:p xmlns:w="http://schemas.openxmlformats.org/wordprocessingml/2006/main">
-      <w:pPr>
-        <w:spacing w:before="40" w:after="40"/>
-        <w:jc w:val="left"/>
-      </w:pPr>
-      <w:r>
-        <w:rPr>
-          <w:rFonts w:ascii="Lexend" w:hAnsi="Lexend"/>
-          <w:color w:val="222222"/>
-          <w:sz w:val="20"/>
-        </w:rPr>
-        <w:t xml:space="preserve">•  </w:t>
-      </w:r>
-      <w:r>
-        <w:rPr>
           <w:rFonts w:ascii="Lexend" w:hAnsi="Lexend"/>
           <w:b/>
           <w:color w:val="222222"/>
           <w:sz w:val="20"/>
         </w:rPr>
-        <w:t xml:space="preserve">BR-7.4</w:t>
-      </w:r>
-      <w:r>
-        <w:rPr>
-          <w:rFonts w:ascii="Lexend" w:hAnsi="Lexend"/>
-          <w:color w:val="222222"/>
-          <w:sz w:val="20"/>
-        </w:rPr>
-        <w:t xml:space="preserve">: Reports in </w:t>
-      </w:r>
-      <w:r>
-        <w:rPr>
-          <w:rFonts w:ascii="Consolas" w:hAnsi="Consolas"/>
-          <w:color w:val="9C4146"/>
-          <w:sz w:val="20"/>
-        </w:rPr>
-        <w:t xml:space="preserve">NEED_MORE_INFO</w:t>
-      </w:r>
-      <w:r>
-        <w:rPr>
-          <w:rFonts w:ascii="Lexend" w:hAnsi="Lexend"/>
-          <w:color w:val="222222"/>
-          <w:sz w:val="20"/>
-        </w:rPr>
-        <w:t xml:space="preserve"> shall automatically transition to </w:t>
-      </w:r>
-      <w:r>
-        <w:rPr>
-          <w:rFonts w:ascii="Consolas" w:hAnsi="Consolas"/>
-          <w:color w:val="9C4146"/>
-          <w:sz w:val="20"/>
-        </w:rPr>
-        <w:t xml:space="preserve">CLOSED_INCOMPLETE</w:t>
-      </w:r>
-      <w:r>
-        <w:rPr>
-          <w:rFonts w:ascii="Lexend" w:hAnsi="Lexend"/>
-          <w:color w:val="222222"/>
-          <w:sz w:val="20"/>
-        </w:rPr>
-        <w:t xml:space="preserve"> after 14 days of researcher inactivity without clarification, preserving the audit record. Reopening is permitted if the researcher subsequently provides the required clarification.</w:t>
-      </w:r>
-    </w:p>
-    <w:p xmlns:w="http://schemas.openxmlformats.org/wordprocessingml/2006/main">
-      <w:pPr>
-        <w:spacing w:before="40" w:after="40"/>
-        <w:jc w:val="left"/>
-      </w:pPr>
-      <w:r>
-        <w:rPr>
-          <w:rFonts w:ascii="Lexend" w:hAnsi="Lexend"/>
-          <w:color w:val="222222"/>
-          <w:sz w:val="20"/>
-        </w:rPr>
-        <w:t xml:space="preserve">•  </w:t>
-      </w:r>
-      <w:r>
-        <w:rPr>
-          <w:rFonts w:ascii="Lexend" w:hAnsi="Lexend"/>
-          <w:b/>
-          <w:color w:val="222222"/>
-          <w:sz w:val="20"/>
-        </w:rPr>
-        <w:t xml:space="preserve">BR-7.5</w:t>
-      </w:r>
-      <w:r>
-        <w:rPr>
-          <w:rFonts w:ascii="Lexend" w:hAnsi="Lexend"/>
-          <w:color w:val="222222"/>
-          <w:sz w:val="20"/>
-        </w:rPr>
-        <w:t xml:space="preserve">: If retesting reveals that the vulnerability persists, the state transition shall record a </w:t>
-      </w:r>
-      <w:r>
-        <w:rPr>
-          <w:rFonts w:ascii="Consolas" w:hAnsi="Consolas"/>
-          <w:color w:val="9C4146"/>
-          <w:sz w:val="20"/>
-        </w:rPr>
-        <w:t xml:space="preserve">RETEST_FAILED</w:t>
-      </w:r>
-      <w:r>
-        <w:rPr>
-          <w:rFonts w:ascii="Lexend" w:hAnsi="Lexend"/>
-          <w:color w:val="222222"/>
-          <w:sz w:val="20"/>
-        </w:rPr>
-        <w:t xml:space="preserve"> audit event and return to </w:t>
-      </w:r>
-      <w:r>
-        <w:rPr>
-          <w:rFonts w:ascii="Consolas" w:hAnsi="Consolas"/>
-          <w:color w:val="9C4146"/>
-          <w:sz w:val="20"/>
-        </w:rPr>
-        <w:t xml:space="preserve">ACCEPTED</w:t>
-      </w:r>
-      <w:r>
-        <w:rPr>
-          <w:rFonts w:ascii="Lexend" w:hAnsi="Lexend"/>
-          <w:color w:val="222222"/>
-          <w:sz w:val="20"/>
-        </w:rPr>
-        <w:t xml:space="preserve">, preserving the failed retest evidence in the immutable audit log.</w:t>
-      </w:r>
-    </w:p>
-    <w:p xmlns:w="http://schemas.openxmlformats.org/wordprocessingml/2006/main">
-      <w:pPr>
-        <w:spacing w:before="40" w:after="40"/>
-        <w:jc w:val="left"/>
-      </w:pPr>
-      <w:r>
-        <w:rPr>
-          <w:rFonts w:ascii="Lexend" w:hAnsi="Lexend"/>
-          <w:color w:val="222222"/>
-          <w:sz w:val="20"/>
-        </w:rPr>
-        <w:t xml:space="preserve">•  </w:t>
-      </w:r>
-      <w:r>
-        <w:rPr>
-          <w:rFonts w:ascii="Lexend" w:hAnsi="Lexend"/>
-          <w:b/>
-          <w:color w:val="222222"/>
-          <w:sz w:val="20"/>
-        </w:rPr>
-        <w:t xml:space="preserve">BR-7.6</w:t>
-      </w:r>
-      <w:r>
-        <w:rPr>
-          <w:rFonts w:ascii="Lexend" w:hAnsi="Lexend"/>
-          <w:color w:val="222222"/>
-          <w:sz w:val="20"/>
-        </w:rPr>
-        <w:t xml:space="preserve">: Reopening any closed report shall require an authorized Defender or Tenant Owner action recording an immutable justification log, transitioning the ticket back to </w:t>
-      </w:r>
-      <w:r>
-        <w:rPr>
-          <w:rFonts w:ascii="Consolas" w:hAnsi="Consolas"/>
-          <w:color w:val="9C4146"/>
-          <w:sz w:val="20"/>
-        </w:rPr>
-        <w:t xml:space="preserve">TRIAGING</w:t>
-      </w:r>
-      <w:r>
-        <w:rPr>
-          <w:rFonts w:ascii="Lexend" w:hAnsi="Lexend"/>
-          <w:color w:val="222222"/>
-          <w:sz w:val="20"/>
-        </w:rPr>
-        <w:t xml:space="preserve">.</w:t>
-      </w:r>
-    </w:p>
-    <w:p xmlns:w="http://schemas.openxmlformats.org/wordprocessingml/2006/main">
-      <w:pPr>
-        <w:spacing w:before="40" w:after="40"/>
-        <w:jc w:val="left"/>
-      </w:pPr>
-      <w:r>
-        <w:rPr>
-          <w:rFonts w:ascii="Lexend" w:hAnsi="Lexend"/>
-          <w:color w:val="222222"/>
-          <w:sz w:val="20"/>
-        </w:rPr>
-        <w:t xml:space="preserve">•  </w:t>
-      </w:r>
-      <w:r>
-        <w:rPr>
-          <w:rFonts w:ascii="Lexend" w:hAnsi="Lexend"/>
-          <w:b/>
-          <w:color w:val="222222"/>
-          <w:sz w:val="20"/>
-        </w:rPr>
-        <w:t xml:space="preserve">BR-7.7</w:t>
+        <w:t xml:space="preserve">BR-7.8</w:t>
       </w:r>
       <w:r>
         <w:rPr>
@@ -8539,7 +8577,55 @@
                 <w:color w:val="222222"/>
                 <w:sz w:val="18"/>
               </w:rPr>
-              <w:t xml:space="preserve">1 active public program, 1 defender seat, up to 5 simultaneously active open reports (if a 6th report is submitted while 5 remain active, intake still encrypts and accepts the payload, displaying a non-blocking quota banner to triage/resolve open tickets or upgrade, guaranteeing zero data loss for security disclosures), 2 GB encrypted storage, signed RFC 9116 generator, GitHub commit verification.</w:t>
+              <w:t xml:space="preserve">1 active public program, 1 defender seat, up to 5 simultaneously active open reports. Bounded intake policy: reports 6+ are encrypted and queued in a </w:t>
+            </w:r>
+            <w:r>
+              <w:rPr>
+                <w:rFonts w:ascii="Consolas" w:hAnsi="Consolas"/>
+                <w:color w:val="9C4146"/>
+                <w:sz w:val="18"/>
+              </w:rPr>
+              <w:t xml:space="preserve">QUOTA_HELD</w:t>
+            </w:r>
+            <w:r>
+              <w:rPr>
+                <w:rFonts w:ascii="Lexend" w:hAnsi="Lexend"/>
+                <w:color w:val="222222"/>
+                <w:sz w:val="18"/>
+              </w:rPr>
+              <w:t xml:space="preserve"> state with an upgrade/triage reminder. Hard bounds: 500 MB maximum tenant storage quota and rate limit of 10 submissions/hr. If hard storage or rate bounds are saturated, intake responds with HTTP 429/507 and displays user guidance directing submitters to the fallback email (</w:t>
+            </w:r>
+            <w:r>
+              <w:rPr>
+                <w:rFonts w:ascii="Consolas" w:hAnsi="Consolas"/>
+                <w:color w:val="9C4146"/>
+                <w:sz w:val="18"/>
+              </w:rPr>
+              <w:t xml:space="preserve">security@tenant.com</w:t>
+            </w:r>
+            <w:r>
+              <w:rPr>
+                <w:rFonts w:ascii="Lexend" w:hAnsi="Lexend"/>
+                <w:color w:val="222222"/>
+                <w:sz w:val="18"/>
+              </w:rPr>
+              <w:t xml:space="preserve"> from their signed </w:t>
+            </w:r>
+            <w:r>
+              <w:rPr>
+                <w:rFonts w:ascii="Consolas" w:hAnsi="Consolas"/>
+                <w:color w:val="9C4146"/>
+                <w:sz w:val="18"/>
+              </w:rPr>
+              <w:t xml:space="preserve">security.txt</w:t>
+            </w:r>
+            <w:r>
+              <w:rPr>
+                <w:rFonts w:ascii="Lexend" w:hAnsi="Lexend"/>
+                <w:color w:val="222222"/>
+                <w:sz w:val="18"/>
+              </w:rPr>
+              <w:t xml:space="preserve">), guaranteeing zero silent data loss. Signed RFC 9116 generator, GitHub commit verification.</w:t>
             </w:r>
           </w:p>
         </w:tc>
@@ -8647,7 +8733,23 @@
                 <w:color w:val="222222"/>
                 <w:sz w:val="18"/>
               </w:rPr>
-              <w:t xml:space="preserve">1 active disclosure program (public or invite-only), up to 5 defender seats (with program-scoped decryption), 10 GB encrypted storage, direct presigned R2 uploads, SLA countdown timers, Slack-compatible webhooks, GitHub commit &amp; branch compare verification, Redacted PDF/JSON Closure Evidence exports.</w:t>
+              <w:t xml:space="preserve">1 active disclosure program (public or invite-only), up to 5 defender seats (with program-scoped decryption via </w:t>
+            </w:r>
+            <w:r>
+              <w:rPr>
+                <w:rFonts w:ascii="Consolas" w:hAnsi="Consolas"/>
+                <w:color w:val="9C4146"/>
+                <w:sz w:val="18"/>
+              </w:rPr>
+              <w:t xml:space="preserve">PROGRAM_DEFENDER</w:t>
+            </w:r>
+            <w:r>
+              <w:rPr>
+                <w:rFonts w:ascii="Lexend" w:hAnsi="Lexend"/>
+                <w:color w:val="222222"/>
+                <w:sz w:val="18"/>
+              </w:rPr>
+              <w:t xml:space="preserve">), 10 GB encrypted storage, direct presigned R2 uploads, SLA countdown timers, Slack-compatible webhooks, GitHub commit &amp; branch compare verification, Redacted PDF/JSON Closure Evidence exports.</w:t>
             </w:r>
           </w:p>
         </w:tc>
@@ -9003,7 +9105,24 @@
           <w:color w:val="222222"/>
           <w:sz w:val="20"/>
         </w:rPr>
-        <w:t xml:space="preserve">•  In all modeled payment scenarios, 2 paying customers reliably cover 100% of the commercial cloud baseline (~$61.00/mo) with a healthy operating margin. All pricing figures represent initial validation hypotheses subject to empirical testing during the commercial pilot.</w:t>
+        <w:t xml:space="preserve">•  </w:t>
+      </w:r>
+      <w:r>
+        <w:rPr>
+          <w:rFonts w:ascii="Lexend" w:hAnsi="Lexend"/>
+          <w:b/>
+          <w:color w:val="222222"/>
+          <w:sz w:val="20"/>
+        </w:rPr>
+        <w:t xml:space="preserve">Infrastructure Break-Even vs. Business Profitability</w:t>
+      </w:r>
+      <w:r>
+        <w:rPr>
+          <w:rFonts w:ascii="Lexend" w:hAnsi="Lexend"/>
+          <w:color w:val="222222"/>
+          <w:sz w:val="20"/>
+        </w:rPr>
+        <w:t xml:space="preserve">: In all modeled payment scenarios, 2 paying customers reliably cover 100% of the commercial cloud baseline (~61.00/mo), proving that the software does not generate hosting debt. However, total commercial business profitability—accounting for founder labor, customer acquisition costs (CAC), support time, refunds, and operating contingencies—requires scaling to 15–30 paying customers (735–$1,470/mo gross). All pricing figures represent initial validation hypotheses subject to empirical testing during the commercial pilot.</w:t>
       </w:r>
     </w:p>
     <w:p xmlns:w="http://schemas.openxmlformats.org/wordprocessingml/2006/main">

</xml_diff>